<commit_message>
ISFARIS-6 Aggiunta sezione 1.4, 1.5, 1.6
</commit_message>
<xml_diff>
--- a/docs/deliverables/RAD - FARIS v.0.2.docx
+++ b/docs/deliverables/RAD - FARIS v.0.2.docx
@@ -4,7 +4,7 @@
   <w:body>
     <w:tbl>
       <w:tblPr>
-        <w:tblStyle w:val="Grigliatabella"/>
+        <w:tblStyle w:val="TableGrid"/>
         <w:tblW w:w="0" w:type="auto"/>
         <w:tblBorders>
           <w:top w:val="none" w:sz="0" w:space="0" w:color="auto"/>
@@ -191,7 +191,7 @@
     </w:p>
     <w:tbl>
       <w:tblPr>
-        <w:tblStyle w:val="Grigliatabella"/>
+        <w:tblStyle w:val="TableGrid"/>
         <w:tblW w:w="6946" w:type="dxa"/>
         <w:tblInd w:w="2268" w:type="dxa"/>
         <w:tblBorders>
@@ -547,18 +547,17 @@
     </w:tbl>
     <w:p>
       <w:pPr>
-        <w:pStyle w:val="Titolo1"/>
-      </w:pPr>
-      <w:bookmarkStart w:id="0" w:name="_Toc243074476"/>
-      <w:r>
-        <w:lastRenderedPageBreak/>
+        <w:pStyle w:val="Heading1"/>
+      </w:pPr>
+      <w:bookmarkStart w:id="0" w:name="_Toc1636767194"/>
+      <w:r>
         <w:t>Team Members</w:t>
       </w:r>
       <w:bookmarkEnd w:id="0"/>
     </w:p>
     <w:tbl>
       <w:tblPr>
-        <w:tblStyle w:val="Tabellagriglia4-colore1"/>
+        <w:tblStyle w:val="GridTable4-Accent1"/>
         <w:tblW w:w="0" w:type="auto"/>
         <w:tblLook w:val="04A0" w:firstRow="1" w:lastRow="0" w:firstColumn="1" w:lastColumn="0" w:noHBand="0" w:noVBand="1"/>
       </w:tblPr>
@@ -779,9 +778,6 @@
             <w:r>
               <w:t>Team Member</w:t>
             </w:r>
-            <w:r>
-              <w:t xml:space="preserve"> &amp; Reviewer</w:t>
-            </w:r>
           </w:p>
         </w:tc>
         <w:tc>
@@ -898,26 +894,20 @@
     </w:p>
     <w:p>
       <w:pPr>
-        <w:pStyle w:val="Titolo1"/>
+        <w:pStyle w:val="Heading1"/>
         <w:pBdr>
           <w:bottom w:val="single" w:sz="6" w:space="1" w:color="auto"/>
         </w:pBdr>
       </w:pPr>
-      <w:bookmarkStart w:id="1" w:name="_Toc243074477"/>
-      <w:proofErr w:type="spellStart"/>
-      <w:r>
-        <w:lastRenderedPageBreak/>
-        <w:t>Revision</w:t>
-      </w:r>
-      <w:proofErr w:type="spellEnd"/>
-      <w:r>
-        <w:t xml:space="preserve"> History</w:t>
+      <w:bookmarkStart w:id="1" w:name="_Toc1477484952"/>
+      <w:r>
+        <w:t>Revision History</w:t>
       </w:r>
       <w:bookmarkEnd w:id="1"/>
     </w:p>
     <w:tbl>
       <w:tblPr>
-        <w:tblStyle w:val="Tabellagriglia4-colore1"/>
+        <w:tblStyle w:val="GridTable4-Accent1"/>
         <w:tblW w:w="0" w:type="auto"/>
         <w:tblLook w:val="04A0" w:firstRow="1" w:lastRow="0" w:firstColumn="1" w:lastColumn="0" w:noHBand="0" w:noVBand="1"/>
       </w:tblPr>
@@ -1143,9 +1133,10 @@
             </w:r>
             <w:r>
               <w:br/>
+              <w:t>1.1, 1.2, 1.3</w:t>
             </w:r>
             <w:r>
-              <w:t>1.1, 1.2, 1.3</w:t>
+              <w:t>, 1.4, 1.5, 1.6</w:t>
             </w:r>
           </w:p>
         </w:tc>
@@ -1161,6 +1152,9 @@
             </w:pPr>
             <w:r>
               <w:t>AR</w:t>
+            </w:r>
+            <w:r>
+              <w:t>, DS</w:t>
             </w:r>
           </w:p>
         </w:tc>
@@ -1339,8 +1333,8 @@
           <w:b/>
           <w:bCs/>
           <w:color w:val="002060"/>
-          <w:sz w:val="28"/>
-          <w:szCs w:val="28"/>
+          <w:sz w:val="30"/>
+          <w:szCs w:val="30"/>
         </w:rPr>
       </w:pPr>
       <w:r>
@@ -1348,10 +1342,9 @@
           <w:b/>
           <w:bCs/>
           <w:color w:val="002060"/>
-          <w:sz w:val="28"/>
-          <w:szCs w:val="28"/>
+          <w:sz w:val="30"/>
+          <w:szCs w:val="30"/>
         </w:rPr>
-        <w:lastRenderedPageBreak/>
         <w:t>S</w:t>
       </w:r>
       <w:r>
@@ -1359,26 +1352,18 @@
           <w:b/>
           <w:bCs/>
           <w:color w:val="002060"/>
-          <w:sz w:val="28"/>
-          <w:szCs w:val="28"/>
+          <w:sz w:val="30"/>
+          <w:szCs w:val="30"/>
         </w:rPr>
         <w:t>ommario</w:t>
       </w:r>
     </w:p>
     <w:p>
       <w:pPr>
-        <w:pStyle w:val="Sommario1"/>
+        <w:pStyle w:val="TOC1"/>
         <w:tabs>
-          <w:tab w:val="right" w:leader="dot" w:pos="10456"/>
+          <w:tab w:val="right" w:leader="dot" w:pos="10455"/>
         </w:tabs>
-        <w:rPr>
-          <w:rFonts w:cstheme="minorBidi"/>
-          <w:noProof/>
-          <w:kern w:val="2"/>
-          <w:sz w:val="24"/>
-          <w:szCs w:val="24"/>
-          <w14:ligatures w14:val="standardContextual"/>
-        </w:rPr>
       </w:pPr>
       <w:r>
         <w:fldChar w:fldCharType="begin"/>
@@ -1389,491 +1374,312 @@
       <w:r>
         <w:fldChar w:fldCharType="separate"/>
       </w:r>
-      <w:hyperlink w:anchor="_Toc243074476" w:history="1">
-        <w:r>
-          <w:rPr>
-            <w:rStyle w:val="Collegamentoipertestuale"/>
-            <w:noProof/>
-          </w:rPr>
+      <w:hyperlink w:anchor="_Toc1636767194" w:history="1">
+        <w:r>
           <w:t>Team Members</w:t>
         </w:r>
         <w:r>
-          <w:rPr>
-            <w:noProof/>
-            <w:webHidden/>
-          </w:rPr>
           <w:tab/>
         </w:r>
         <w:r>
-          <w:rPr>
-            <w:noProof/>
-            <w:webHidden/>
-          </w:rPr>
           <w:fldChar w:fldCharType="begin"/>
         </w:r>
         <w:r>
-          <w:rPr>
-            <w:noProof/>
-            <w:webHidden/>
-          </w:rPr>
-          <w:instrText xml:space="preserve"> PAGEREF _Toc243074476 \h </w:instrText>
-        </w:r>
-        <w:r>
-          <w:rPr>
-            <w:noProof/>
-            <w:webHidden/>
-          </w:rPr>
-        </w:r>
-        <w:r>
-          <w:rPr>
-            <w:noProof/>
-            <w:webHidden/>
-          </w:rPr>
+          <w:instrText>PAGEREF _Toc1636767194 \h</w:instrText>
+        </w:r>
+        <w:r>
           <w:fldChar w:fldCharType="separate"/>
         </w:r>
         <w:r>
-          <w:rPr>
-            <w:noProof/>
-            <w:webHidden/>
-          </w:rPr>
-          <w:t>2</w:t>
-        </w:r>
-        <w:r>
-          <w:rPr>
-            <w:noProof/>
-            <w:webHidden/>
-          </w:rPr>
+          <w:t>1</w:t>
+        </w:r>
+        <w:r>
           <w:fldChar w:fldCharType="end"/>
         </w:r>
       </w:hyperlink>
     </w:p>
     <w:p>
       <w:pPr>
-        <w:pStyle w:val="Sommario1"/>
+        <w:pStyle w:val="TOC1"/>
         <w:tabs>
-          <w:tab w:val="right" w:leader="dot" w:pos="10456"/>
+          <w:tab w:val="right" w:leader="dot" w:pos="10455"/>
         </w:tabs>
-        <w:rPr>
-          <w:rFonts w:cstheme="minorBidi"/>
-          <w:noProof/>
-          <w:kern w:val="2"/>
-          <w:sz w:val="24"/>
-          <w:szCs w:val="24"/>
-          <w14:ligatures w14:val="standardContextual"/>
-        </w:rPr>
-      </w:pPr>
-      <w:hyperlink w:anchor="_Toc243074477" w:history="1">
-        <w:r>
-          <w:rPr>
-            <w:rStyle w:val="Collegamentoipertestuale"/>
-            <w:noProof/>
-          </w:rPr>
+      </w:pPr>
+      <w:hyperlink w:anchor="_Toc1477484952" w:history="1">
+        <w:r>
           <w:t>Revision History</w:t>
         </w:r>
         <w:r>
-          <w:rPr>
-            <w:noProof/>
-            <w:webHidden/>
-          </w:rPr>
           <w:tab/>
         </w:r>
         <w:r>
-          <w:rPr>
-            <w:noProof/>
-            <w:webHidden/>
-          </w:rPr>
           <w:fldChar w:fldCharType="begin"/>
         </w:r>
         <w:r>
-          <w:rPr>
-            <w:noProof/>
-            <w:webHidden/>
-          </w:rPr>
-          <w:instrText xml:space="preserve"> PAGEREF _Toc243074477 \h </w:instrText>
-        </w:r>
-        <w:r>
-          <w:rPr>
-            <w:noProof/>
-            <w:webHidden/>
-          </w:rPr>
-        </w:r>
-        <w:r>
-          <w:rPr>
-            <w:noProof/>
-            <w:webHidden/>
-          </w:rPr>
+          <w:instrText>PAGEREF _Toc1477484952 \h</w:instrText>
+        </w:r>
+        <w:r>
           <w:fldChar w:fldCharType="separate"/>
         </w:r>
         <w:r>
-          <w:rPr>
-            <w:noProof/>
-            <w:webHidden/>
-          </w:rPr>
+          <w:t>1</w:t>
+        </w:r>
+        <w:r>
+          <w:fldChar w:fldCharType="end"/>
+        </w:r>
+      </w:hyperlink>
+    </w:p>
+    <w:p>
+      <w:pPr>
+        <w:pStyle w:val="TOC1"/>
+        <w:tabs>
+          <w:tab w:val="left" w:pos="435"/>
+          <w:tab w:val="right" w:leader="dot" w:pos="10455"/>
+        </w:tabs>
+      </w:pPr>
+      <w:hyperlink w:anchor="_Toc2071705618" w:history="1">
+        <w:r>
+          <w:t>1.</w:t>
+        </w:r>
+        <w:r>
+          <w:tab/>
+        </w:r>
+        <w:r>
+          <w:t>Introduzione</w:t>
+        </w:r>
+        <w:r>
+          <w:tab/>
+        </w:r>
+        <w:r>
+          <w:fldChar w:fldCharType="begin"/>
+        </w:r>
+        <w:r>
+          <w:instrText>PAGEREF _Toc2071705618 \h</w:instrText>
+        </w:r>
+        <w:r>
+          <w:fldChar w:fldCharType="separate"/>
+        </w:r>
+        <w:r>
           <w:t>3</w:t>
         </w:r>
         <w:r>
-          <w:rPr>
-            <w:noProof/>
-            <w:webHidden/>
-          </w:rPr>
           <w:fldChar w:fldCharType="end"/>
         </w:r>
       </w:hyperlink>
     </w:p>
     <w:p>
       <w:pPr>
-        <w:pStyle w:val="Sommario1"/>
+        <w:pStyle w:val="TOC2"/>
         <w:tabs>
-          <w:tab w:val="right" w:leader="dot" w:pos="10456"/>
+          <w:tab w:val="left" w:pos="660"/>
+          <w:tab w:val="right" w:leader="dot" w:pos="10455"/>
         </w:tabs>
-        <w:rPr>
-          <w:rFonts w:cstheme="minorBidi"/>
-          <w:noProof/>
-          <w:kern w:val="2"/>
-          <w:sz w:val="24"/>
-          <w:szCs w:val="24"/>
-          <w14:ligatures w14:val="standardContextual"/>
-        </w:rPr>
-      </w:pPr>
-      <w:hyperlink w:anchor="_Toc243074478" w:history="1">
-        <w:r>
-          <w:rPr>
-            <w:rStyle w:val="Collegamentoipertestuale"/>
-            <w:noProof/>
-          </w:rPr>
-          <w:t>Introduzione</w:t>
-        </w:r>
-        <w:r>
-          <w:rPr>
-            <w:noProof/>
-            <w:webHidden/>
-          </w:rPr>
+      </w:pPr>
+      <w:hyperlink w:anchor="_Toc929883785" w:history="1">
+        <w:r>
+          <w:t>1.1</w:t>
+        </w:r>
+        <w:r>
           <w:tab/>
         </w:r>
         <w:r>
-          <w:rPr>
-            <w:noProof/>
-            <w:webHidden/>
-          </w:rPr>
+          <w:t>Obiettivo del Sistema</w:t>
+        </w:r>
+        <w:r>
+          <w:tab/>
+        </w:r>
+        <w:r>
           <w:fldChar w:fldCharType="begin"/>
         </w:r>
         <w:r>
-          <w:rPr>
-            <w:noProof/>
-            <w:webHidden/>
-          </w:rPr>
-          <w:instrText xml:space="preserve"> PAGEREF _Toc243074478 \h </w:instrText>
-        </w:r>
-        <w:r>
-          <w:rPr>
-            <w:noProof/>
-            <w:webHidden/>
-          </w:rPr>
-        </w:r>
-        <w:r>
-          <w:rPr>
-            <w:noProof/>
-            <w:webHidden/>
-          </w:rPr>
+          <w:instrText>PAGEREF _Toc929883785 \h</w:instrText>
+        </w:r>
+        <w:r>
           <w:fldChar w:fldCharType="separate"/>
         </w:r>
         <w:r>
-          <w:rPr>
-            <w:noProof/>
-            <w:webHidden/>
-          </w:rPr>
+          <w:t>4</w:t>
+        </w:r>
+        <w:r>
+          <w:fldChar w:fldCharType="end"/>
+        </w:r>
+      </w:hyperlink>
+    </w:p>
+    <w:p>
+      <w:pPr>
+        <w:pStyle w:val="TOC2"/>
+        <w:tabs>
+          <w:tab w:val="left" w:pos="660"/>
+          <w:tab w:val="right" w:leader="dot" w:pos="10455"/>
+        </w:tabs>
+      </w:pPr>
+      <w:hyperlink w:anchor="_Toc118500216" w:history="1">
+        <w:r>
+          <w:t>1.2</w:t>
+        </w:r>
+        <w:r>
+          <w:tab/>
+        </w:r>
+        <w:r>
+          <w:t>Ambito del Sistema</w:t>
+        </w:r>
+        <w:r>
+          <w:tab/>
+        </w:r>
+        <w:r>
+          <w:fldChar w:fldCharType="begin"/>
+        </w:r>
+        <w:r>
+          <w:instrText>PAGEREF _Toc118500216 \h</w:instrText>
+        </w:r>
+        <w:r>
+          <w:fldChar w:fldCharType="separate"/>
+        </w:r>
+        <w:r>
+          <w:t>4</w:t>
+        </w:r>
+        <w:r>
+          <w:fldChar w:fldCharType="end"/>
+        </w:r>
+      </w:hyperlink>
+    </w:p>
+    <w:p>
+      <w:pPr>
+        <w:pStyle w:val="TOC2"/>
+        <w:tabs>
+          <w:tab w:val="left" w:pos="660"/>
+          <w:tab w:val="right" w:leader="dot" w:pos="10455"/>
+        </w:tabs>
+      </w:pPr>
+      <w:hyperlink w:anchor="_Toc458841592" w:history="1">
+        <w:r>
+          <w:t>1.3</w:t>
+        </w:r>
+        <w:r>
+          <w:tab/>
+        </w:r>
+        <w:r>
+          <w:t>Obiettivi e Criteri di Successo</w:t>
+        </w:r>
+        <w:r>
+          <w:tab/>
+        </w:r>
+        <w:r>
+          <w:fldChar w:fldCharType="begin"/>
+        </w:r>
+        <w:r>
+          <w:instrText>PAGEREF _Toc458841592 \h</w:instrText>
+        </w:r>
+        <w:r>
+          <w:fldChar w:fldCharType="separate"/>
+        </w:r>
+        <w:r>
           <w:t>5</w:t>
         </w:r>
         <w:r>
-          <w:rPr>
-            <w:noProof/>
-            <w:webHidden/>
-          </w:rPr>
           <w:fldChar w:fldCharType="end"/>
         </w:r>
       </w:hyperlink>
     </w:p>
     <w:p>
       <w:pPr>
-        <w:pStyle w:val="Sommario2"/>
+        <w:pStyle w:val="TOC2"/>
         <w:tabs>
-          <w:tab w:val="left" w:pos="960"/>
-          <w:tab w:val="right" w:leader="dot" w:pos="10456"/>
+          <w:tab w:val="right" w:leader="dot" w:pos="10455"/>
         </w:tabs>
-        <w:rPr>
-          <w:rFonts w:cstheme="minorBidi"/>
-          <w:noProof/>
-          <w:kern w:val="2"/>
-          <w:sz w:val="24"/>
-          <w:szCs w:val="24"/>
-          <w14:ligatures w14:val="standardContextual"/>
-        </w:rPr>
-      </w:pPr>
-      <w:hyperlink w:anchor="_Toc243074479" w:history="1">
-        <w:r>
-          <w:rPr>
-            <w:rStyle w:val="Collegamentoipertestuale"/>
-            <w:noProof/>
-          </w:rPr>
-          <w:t>1.1</w:t>
-        </w:r>
-        <w:r>
-          <w:rPr>
-            <w:rFonts w:cstheme="minorBidi"/>
-            <w:noProof/>
-            <w:kern w:val="2"/>
-            <w:sz w:val="24"/>
-            <w:szCs w:val="24"/>
-            <w14:ligatures w14:val="standardContextual"/>
-          </w:rPr>
+      </w:pPr>
+      <w:hyperlink w:anchor="_Toc2075145779" w:history="1">
+        <w:r>
+          <w:t>1.4 Definizioni, Acronimi e Abbreviazioni</w:t>
+        </w:r>
+        <w:r>
           <w:tab/>
         </w:r>
         <w:r>
-          <w:rPr>
-            <w:rStyle w:val="Collegamentoipertestuale"/>
-            <w:noProof/>
-          </w:rPr>
-          <w:t>Obiettivo del Sistema</w:t>
-        </w:r>
-        <w:r>
-          <w:rPr>
-            <w:noProof/>
-            <w:webHidden/>
-          </w:rPr>
+          <w:fldChar w:fldCharType="begin"/>
+        </w:r>
+        <w:r>
+          <w:instrText>PAGEREF _Toc2075145779 \h</w:instrText>
+        </w:r>
+        <w:r>
+          <w:fldChar w:fldCharType="separate"/>
+        </w:r>
+        <w:r>
+          <w:t>6</w:t>
+        </w:r>
+        <w:r>
+          <w:fldChar w:fldCharType="end"/>
+        </w:r>
+      </w:hyperlink>
+    </w:p>
+    <w:p>
+      <w:pPr>
+        <w:pStyle w:val="TOC2"/>
+        <w:tabs>
+          <w:tab w:val="right" w:leader="dot" w:pos="10455"/>
+        </w:tabs>
+      </w:pPr>
+      <w:hyperlink w:anchor="_Toc1813775564" w:history="1">
+        <w:r>
+          <w:t>1.5 Riferimenti</w:t>
+        </w:r>
+        <w:r>
           <w:tab/>
         </w:r>
         <w:r>
-          <w:rPr>
-            <w:noProof/>
-            <w:webHidden/>
-          </w:rPr>
           <w:fldChar w:fldCharType="begin"/>
         </w:r>
         <w:r>
-          <w:rPr>
-            <w:noProof/>
-            <w:webHidden/>
-          </w:rPr>
-          <w:instrText xml:space="preserve"> PAGEREF _Toc243074479 \h </w:instrText>
-        </w:r>
-        <w:r>
-          <w:rPr>
-            <w:noProof/>
-            <w:webHidden/>
-          </w:rPr>
-        </w:r>
-        <w:r>
-          <w:rPr>
-            <w:noProof/>
-            <w:webHidden/>
-          </w:rPr>
+          <w:instrText>PAGEREF _Toc1813775564 \h</w:instrText>
+        </w:r>
+        <w:r>
           <w:fldChar w:fldCharType="separate"/>
         </w:r>
         <w:r>
-          <w:rPr>
-            <w:noProof/>
-            <w:webHidden/>
-          </w:rPr>
-          <w:t>5</w:t>
-        </w:r>
-        <w:r>
-          <w:rPr>
-            <w:noProof/>
-            <w:webHidden/>
-          </w:rPr>
+          <w:t>6</w:t>
+        </w:r>
+        <w:r>
           <w:fldChar w:fldCharType="end"/>
         </w:r>
       </w:hyperlink>
     </w:p>
     <w:p>
       <w:pPr>
-        <w:pStyle w:val="Sommario2"/>
+        <w:pStyle w:val="TOC2"/>
         <w:tabs>
-          <w:tab w:val="left" w:pos="960"/>
-          <w:tab w:val="right" w:leader="dot" w:pos="10456"/>
+          <w:tab w:val="right" w:leader="dot" w:pos="10455"/>
         </w:tabs>
-        <w:rPr>
-          <w:rFonts w:cstheme="minorBidi"/>
-          <w:noProof/>
-          <w:kern w:val="2"/>
-          <w:sz w:val="24"/>
-          <w:szCs w:val="24"/>
-          <w14:ligatures w14:val="standardContextual"/>
-        </w:rPr>
-      </w:pPr>
-      <w:hyperlink w:anchor="_Toc243074480" w:history="1">
-        <w:r>
-          <w:rPr>
-            <w:rStyle w:val="Collegamentoipertestuale"/>
-            <w:noProof/>
-          </w:rPr>
-          <w:t>1.2</w:t>
-        </w:r>
-        <w:r>
-          <w:rPr>
-            <w:rFonts w:cstheme="minorBidi"/>
-            <w:noProof/>
-            <w:kern w:val="2"/>
-            <w:sz w:val="24"/>
-            <w:szCs w:val="24"/>
-            <w14:ligatures w14:val="standardContextual"/>
-          </w:rPr>
+      </w:pPr>
+      <w:hyperlink w:anchor="_Toc25628081" w:history="1">
+        <w:r>
+          <w:t>1.6 Organizzazione del Documento</w:t>
+        </w:r>
+        <w:r>
           <w:tab/>
         </w:r>
         <w:r>
-          <w:rPr>
-            <w:rStyle w:val="Collegamentoipertestuale"/>
-            <w:noProof/>
-          </w:rPr>
-          <w:t>Ambito del Sistema</w:t>
-        </w:r>
-        <w:r>
-          <w:rPr>
-            <w:noProof/>
-            <w:webHidden/>
-          </w:rPr>
-          <w:tab/>
-        </w:r>
-        <w:r>
-          <w:rPr>
-            <w:noProof/>
-            <w:webHidden/>
-          </w:rPr>
           <w:fldChar w:fldCharType="begin"/>
         </w:r>
         <w:r>
-          <w:rPr>
-            <w:noProof/>
-            <w:webHidden/>
-          </w:rPr>
-          <w:instrText xml:space="preserve"> PAGEREF _Toc243074480 \h </w:instrText>
-        </w:r>
-        <w:r>
-          <w:rPr>
-            <w:noProof/>
-            <w:webHidden/>
-          </w:rPr>
-        </w:r>
-        <w:r>
-          <w:rPr>
-            <w:noProof/>
-            <w:webHidden/>
-          </w:rPr>
+          <w:instrText>PAGEREF _Toc25628081 \h</w:instrText>
+        </w:r>
+        <w:r>
           <w:fldChar w:fldCharType="separate"/>
         </w:r>
         <w:r>
-          <w:rPr>
-            <w:noProof/>
-            <w:webHidden/>
-          </w:rPr>
-          <w:t>5</w:t>
-        </w:r>
-        <w:r>
-          <w:rPr>
-            <w:noProof/>
-            <w:webHidden/>
-          </w:rPr>
+          <w:t>6</w:t>
+        </w:r>
+        <w:r>
           <w:fldChar w:fldCharType="end"/>
         </w:r>
       </w:hyperlink>
     </w:p>
     <w:p>
-      <w:pPr>
-        <w:pStyle w:val="Sommario2"/>
-        <w:tabs>
-          <w:tab w:val="left" w:pos="960"/>
-          <w:tab w:val="right" w:leader="dot" w:pos="10456"/>
-        </w:tabs>
-        <w:rPr>
-          <w:rFonts w:cstheme="minorBidi"/>
-          <w:noProof/>
-          <w:kern w:val="2"/>
-          <w:sz w:val="24"/>
-          <w:szCs w:val="24"/>
-          <w14:ligatures w14:val="standardContextual"/>
-        </w:rPr>
-      </w:pPr>
-      <w:hyperlink w:anchor="_Toc243074481" w:history="1">
-        <w:r>
-          <w:rPr>
-            <w:rStyle w:val="Collegamentoipertestuale"/>
-            <w:noProof/>
-          </w:rPr>
-          <w:t>1.3</w:t>
-        </w:r>
-        <w:r>
-          <w:rPr>
-            <w:rFonts w:cstheme="minorBidi"/>
-            <w:noProof/>
-            <w:kern w:val="2"/>
-            <w:sz w:val="24"/>
-            <w:szCs w:val="24"/>
-            <w14:ligatures w14:val="standardContextual"/>
-          </w:rPr>
-          <w:tab/>
-        </w:r>
-        <w:r>
-          <w:rPr>
-            <w:rStyle w:val="Collegamentoipertestuale"/>
-            <w:noProof/>
-          </w:rPr>
-          <w:t>Obiettivi e Criteri di Successo</w:t>
-        </w:r>
-        <w:r>
-          <w:rPr>
-            <w:noProof/>
-            <w:webHidden/>
-          </w:rPr>
-          <w:tab/>
-        </w:r>
-        <w:r>
-          <w:rPr>
-            <w:noProof/>
-            <w:webHidden/>
-          </w:rPr>
-          <w:fldChar w:fldCharType="begin"/>
-        </w:r>
-        <w:r>
-          <w:rPr>
-            <w:noProof/>
-            <w:webHidden/>
-          </w:rPr>
-          <w:instrText xml:space="preserve"> PAGEREF _Toc243074481 \h </w:instrText>
-        </w:r>
-        <w:r>
-          <w:rPr>
-            <w:noProof/>
-            <w:webHidden/>
-          </w:rPr>
-        </w:r>
-        <w:r>
-          <w:rPr>
-            <w:noProof/>
-            <w:webHidden/>
-          </w:rPr>
-          <w:fldChar w:fldCharType="separate"/>
-        </w:r>
-        <w:r>
-          <w:rPr>
-            <w:noProof/>
-            <w:webHidden/>
-          </w:rPr>
-          <w:t>6</w:t>
-        </w:r>
-        <w:r>
-          <w:rPr>
-            <w:noProof/>
-            <w:webHidden/>
-          </w:rPr>
-          <w:fldChar w:fldCharType="end"/>
-        </w:r>
-      </w:hyperlink>
-    </w:p>
-    <w:p>
       <w:r>
         <w:fldChar w:fldCharType="end"/>
       </w:r>
     </w:p>
+    <w:p/>
     <w:p>
       <w:r>
         <w:br w:type="page"/>
@@ -1881,27 +1687,27 @@
     </w:p>
     <w:p>
       <w:pPr>
-        <w:pStyle w:val="Titolo1"/>
-        <w:pBdr>
-          <w:bottom w:val="single" w:sz="6" w:space="1" w:color="auto"/>
-        </w:pBdr>
-      </w:pPr>
-      <w:bookmarkStart w:id="2" w:name="_Toc243074478"/>
-      <w:r>
-        <w:lastRenderedPageBreak/>
+        <w:pStyle w:val="Heading1"/>
+        <w:numPr>
+          <w:ilvl w:val="0"/>
+          <w:numId w:val="13"/>
+        </w:numPr>
+      </w:pPr>
+      <w:bookmarkStart w:id="2" w:name="_Toc2071705618"/>
+      <w:r>
         <w:t>Introduzione</w:t>
       </w:r>
       <w:bookmarkEnd w:id="2"/>
     </w:p>
     <w:p>
       <w:pPr>
-        <w:pStyle w:val="Titolo2"/>
+        <w:pStyle w:val="Heading2"/>
         <w:numPr>
           <w:ilvl w:val="1"/>
-          <w:numId w:val="1"/>
+          <w:numId w:val="5"/>
         </w:numPr>
       </w:pPr>
-      <w:bookmarkStart w:id="3" w:name="_Toc243074479"/>
+      <w:bookmarkStart w:id="3" w:name="_Toc929883785"/>
       <w:r>
         <w:t>Obiettivo del Sistema</w:t>
       </w:r>
@@ -1919,566 +1725,534 @@
           <w:i/>
           <w:iCs/>
         </w:rPr>
-        <w:t xml:space="preserve">information </w:t>
-      </w:r>
-      <w:proofErr w:type="spellStart"/>
+        <w:t>information overloaded</w:t>
+      </w:r>
+      <w:r>
+        <w:t xml:space="preserve"> (sovraccarico informativo) causato da un’eccessiva fruizione di informazioni da diverse testate giornalistiche e/o canali di informazione. </w:t>
+      </w:r>
+      <w:r>
+        <w:br/>
+        <w:t xml:space="preserve">Il progetto FARIS nasce dall’idea di aiutare gli utenti a migliorare la fruibilità delle notizie di loro interesse, tramite un’applicazione desktop </w:t>
+      </w:r>
+      <w:r>
+        <w:t>multiutente</w:t>
+      </w:r>
+      <w:r>
+        <w:t xml:space="preserve"> per la gestione, l’aggregazione e fruizione personalizzata di informazioni e notizie provenienti da fonti giornalistiche online. Il sistema deve supportare:</w:t>
+      </w:r>
+    </w:p>
+    <w:p>
+      <w:pPr>
+        <w:pStyle w:val="ListParagraph"/>
+        <w:numPr>
+          <w:ilvl w:val="0"/>
+          <w:numId w:val="10"/>
+        </w:numPr>
+        <w:jc w:val="both"/>
+      </w:pPr>
+      <w:r>
+        <w:t>La registrazione, autenticazione e gestione di profili distinti;</w:t>
+      </w:r>
+    </w:p>
+    <w:p>
+      <w:pPr>
+        <w:pStyle w:val="ListParagraph"/>
+        <w:numPr>
+          <w:ilvl w:val="0"/>
+          <w:numId w:val="10"/>
+        </w:numPr>
+        <w:jc w:val="both"/>
+      </w:pPr>
+      <w:r>
+        <w:t>La definizione ed aggiornamento delle preferenze e tematiche di interesse dell’utente;</w:t>
+      </w:r>
+    </w:p>
+    <w:p>
+      <w:pPr>
+        <w:pStyle w:val="ListParagraph"/>
+        <w:numPr>
+          <w:ilvl w:val="0"/>
+          <w:numId w:val="10"/>
+        </w:numPr>
+        <w:jc w:val="both"/>
+      </w:pPr>
+      <w:r>
+        <w:t>Gestione del download e parsing asincrono periodico dalle sorgenti di feed RSS;</w:t>
+      </w:r>
+    </w:p>
+    <w:p>
+      <w:pPr>
+        <w:pStyle w:val="ListParagraph"/>
+        <w:numPr>
+          <w:ilvl w:val="0"/>
+          <w:numId w:val="10"/>
+        </w:numPr>
+        <w:jc w:val="both"/>
+      </w:pPr>
+      <w:r>
+        <w:t>Indicizzazione e visualizzazione filtrata degli articoli in base alle preferenze dell’utente autenticato.</w:t>
+      </w:r>
+    </w:p>
+    <w:p>
+      <w:pPr>
+        <w:pStyle w:val="ListParagraph"/>
+        <w:numPr>
+          <w:ilvl w:val="0"/>
+          <w:numId w:val="10"/>
+        </w:numPr>
+        <w:jc w:val="both"/>
+      </w:pPr>
+      <w:r>
+        <w:t>Interrogazione tramite linguaggio naturale di un assistente conversazionale locale.</w:t>
+      </w:r>
+    </w:p>
+    <w:p>
+      <w:pPr>
+        <w:jc w:val="both"/>
+      </w:pPr>
+    </w:p>
+    <w:p>
+      <w:pPr>
+        <w:pStyle w:val="Heading2"/>
+        <w:numPr>
+          <w:ilvl w:val="1"/>
+          <w:numId w:val="5"/>
+        </w:numPr>
+      </w:pPr>
+      <w:bookmarkStart w:id="4" w:name="_Toc118500216"/>
+      <w:r>
+        <w:t>Ambito</w:t>
+      </w:r>
+      <w:r>
+        <w:t xml:space="preserve"> del Sistema</w:t>
+      </w:r>
+      <w:bookmarkEnd w:id="4"/>
+    </w:p>
+    <w:p>
+      <w:r>
+        <w:t xml:space="preserve">L’applicazione </w:t>
+      </w:r>
+      <w:r>
+        <w:t>sarà sviluppata</w:t>
+      </w:r>
+      <w:r>
+        <w:t xml:space="preserve"> </w:t>
+      </w:r>
+      <w:r>
+        <w:t xml:space="preserve">per </w:t>
+      </w:r>
+      <w:r>
+        <w:t>supportare lettori assidui di notizie, professionisti e studenti universitari</w:t>
+      </w:r>
+      <w:r>
+        <w:t xml:space="preserve"> nella fruizione di molteplic</w:t>
+      </w:r>
+      <w:r>
+        <w:t xml:space="preserve">i fonti di informazioni digitali, </w:t>
+      </w:r>
+      <w:r>
+        <w:t>contrastando il fenomeno del sovraccarico informativo.</w:t>
+      </w:r>
+    </w:p>
+    <w:p>
+      <w:r>
+        <w:t>L’applicazione permetterà agli utenti di registrarsi e personalizzare la propria esperienza</w:t>
+      </w:r>
+      <w:r>
+        <w:t xml:space="preserve"> mediante </w:t>
+      </w:r>
+      <w:r>
+        <w:t>una profilazione iniziale basata su tag tematici e interessi</w:t>
+      </w:r>
+      <w:r>
+        <w:t>,</w:t>
+      </w:r>
+      <w:r>
+        <w:t xml:space="preserve"> visualizzando una bacheca filtrata che evidenzi solo articoli effettivamente pertinenti alle loro preferen</w:t>
+      </w:r>
+      <w:r>
+        <w:t>ze</w:t>
+      </w:r>
+      <w:r>
+        <w:t>.</w:t>
+      </w:r>
+    </w:p>
+    <w:p>
+      <w:r>
+        <w:t xml:space="preserve">L’applicazione </w:t>
+      </w:r>
+      <w:r>
+        <w:t xml:space="preserve">permetterà di </w:t>
+      </w:r>
+      <w:r>
+        <w:t>aggiungere, validare e gestire liberamente le fonti</w:t>
+      </w:r>
+      <w:r>
+        <w:t xml:space="preserve">, </w:t>
+      </w:r>
+      <w:r>
+        <w:t xml:space="preserve">a partire da un catalogo </w:t>
+      </w:r>
+      <w:r>
+        <w:t xml:space="preserve">predeterminato </w:t>
+      </w:r>
+      <w:r>
+        <w:t xml:space="preserve">– e </w:t>
+      </w:r>
+      <w:r>
+        <w:t>verificate</w:t>
+      </w:r>
+      <w:r>
+        <w:t xml:space="preserve"> </w:t>
+      </w:r>
+      <w:r>
+        <w:t>-,</w:t>
+      </w:r>
+      <w:r>
+        <w:t xml:space="preserve"> eseguendo </w:t>
+      </w:r>
+      <w:r>
+        <w:t>il periodico download asincrono</w:t>
+      </w:r>
+      <w:r>
+        <w:t xml:space="preserve"> dei contenuti.</w:t>
+      </w:r>
+    </w:p>
+    <w:p>
+      <w:r>
+        <w:t>L’applicazione permetterà agli utenti con ruolo esperto di arricchire le notizie aggiungendo delle note di analisi</w:t>
+      </w:r>
+      <w:r>
+        <w:t>, fornendo un approfondimento visibile agli altri lettori</w:t>
+      </w:r>
+      <w:r>
+        <w:t>, differenziato dal flusso standard dell’informazione.</w:t>
+      </w:r>
+    </w:p>
+    <w:p>
+      <w:r>
+        <w:t>Inoltre,</w:t>
+      </w:r>
+      <w:r>
+        <w:t xml:space="preserve"> il sistema integra un assistente conversazionale</w:t>
+      </w:r>
+      <w:r>
+        <w:t xml:space="preserve"> che permetterà agli utenti di porre domande in linguaggio naturale</w:t>
+      </w:r>
+      <w:r>
+        <w:t xml:space="preserve"> -</w:t>
+      </w:r>
+      <w:r>
+        <w:t xml:space="preserve"> </w:t>
+      </w:r>
+      <w:r>
+        <w:t>come, ad esempio,</w:t>
+      </w:r>
+      <w:r>
+        <w:t xml:space="preserve"> le principali novità della settimana su specifici argomenti</w:t>
+      </w:r>
+      <w:r>
+        <w:t xml:space="preserve"> -,</w:t>
+      </w:r>
+      <w:r>
+        <w:t xml:space="preserve"> generando risposte sintetiche e verificate</w:t>
+      </w:r>
+      <w:r>
+        <w:t>.</w:t>
+      </w:r>
+    </w:p>
+    <w:p>
+      <w:r>
+        <w:t>Nel dettaglio le funzionalità sono:</w:t>
+      </w:r>
+    </w:p>
+    <w:p>
+      <w:pPr>
+        <w:pStyle w:val="ListParagraph"/>
+        <w:numPr>
+          <w:ilvl w:val="0"/>
+          <w:numId w:val="9"/>
+        </w:numPr>
+      </w:pPr>
+      <w:r>
+        <w:t>Consentire ad un utente di registrarsi alla piattaforma e impostando le proprie preferenze e categorie tematiche di interesse.</w:t>
+      </w:r>
+    </w:p>
+    <w:p>
+      <w:pPr>
+        <w:pStyle w:val="ListParagraph"/>
+        <w:numPr>
+          <w:ilvl w:val="0"/>
+          <w:numId w:val="9"/>
+        </w:numPr>
+      </w:pPr>
+      <w:r>
+        <w:t xml:space="preserve">Consentire agli utenti </w:t>
+      </w:r>
+      <w:r>
+        <w:t>con token di</w:t>
+      </w:r>
+      <w:r>
+        <w:t xml:space="preserve"> convalida di ottenere il ruolo di utente esperto.</w:t>
+      </w:r>
+    </w:p>
+    <w:p>
+      <w:pPr>
+        <w:pStyle w:val="ListParagraph"/>
+        <w:numPr>
+          <w:ilvl w:val="0"/>
+          <w:numId w:val="9"/>
+        </w:numPr>
+      </w:pPr>
+      <w:r>
+        <w:t>Consentire la gestione delle sorgenti informative tramite l’inserimento</w:t>
+      </w:r>
+      <w:r>
+        <w:t xml:space="preserve">, la modifica e l’eliminazione </w:t>
+      </w:r>
+      <w:r>
+        <w:t>dei canali non più desiderati</w:t>
+      </w:r>
+      <w:r>
+        <w:t>.</w:t>
+      </w:r>
+    </w:p>
+    <w:p>
+      <w:pPr>
+        <w:pStyle w:val="ListParagraph"/>
+        <w:numPr>
+          <w:ilvl w:val="0"/>
+          <w:numId w:val="9"/>
+        </w:numPr>
+      </w:pPr>
+      <w:r>
+        <w:t>Consentire la gestione</w:t>
+      </w:r>
+      <w:r>
+        <w:t xml:space="preserve"> delle tematiche di interesse tramite l’inserimento</w:t>
+      </w:r>
+      <w:r>
+        <w:t xml:space="preserve"> </w:t>
+      </w:r>
+      <w:r>
+        <w:t>e la modifica delle</w:t>
+      </w:r>
+      <w:r>
+        <w:t xml:space="preserve"> stesse.</w:t>
+      </w:r>
+    </w:p>
+    <w:p>
+      <w:pPr>
+        <w:pStyle w:val="ListParagraph"/>
+        <w:numPr>
+          <w:ilvl w:val="0"/>
+          <w:numId w:val="9"/>
+        </w:numPr>
+      </w:pPr>
+      <w:r>
+        <w:t xml:space="preserve">Sincronizzare periodicamente </w:t>
+      </w:r>
+      <w:r>
+        <w:t>i contenuti dei feed</w:t>
+      </w:r>
+      <w:r>
+        <w:t>.</w:t>
+      </w:r>
+    </w:p>
+    <w:p>
+      <w:pPr>
+        <w:pStyle w:val="ListParagraph"/>
+        <w:numPr>
+          <w:ilvl w:val="0"/>
+          <w:numId w:val="9"/>
+        </w:numPr>
+      </w:pPr>
+      <w:r>
+        <w:t>Consentire la visualizzazione e consultazione della bacheca articoli filtrata in base al profilo dell’utente autenticato.</w:t>
+      </w:r>
+    </w:p>
+    <w:p>
+      <w:pPr>
+        <w:pStyle w:val="ListParagraph"/>
+        <w:numPr>
+          <w:ilvl w:val="0"/>
+          <w:numId w:val="9"/>
+        </w:numPr>
+      </w:pPr>
+      <w:r>
+        <w:t xml:space="preserve">Consentire agli utenti esperti di </w:t>
+      </w:r>
+      <w:r>
+        <w:t>aggiungere e modificare</w:t>
+      </w:r>
+      <w:r>
+        <w:t xml:space="preserve"> note editoriali, pareri e approfondimenti a specifici articoli.</w:t>
+      </w:r>
+    </w:p>
+    <w:p>
+      <w:pPr>
+        <w:pStyle w:val="ListParagraph"/>
+        <w:numPr>
+          <w:ilvl w:val="0"/>
+          <w:numId w:val="9"/>
+        </w:numPr>
+      </w:pPr>
+      <w:r>
+        <w:t xml:space="preserve">Fornire </w:t>
+      </w:r>
+      <w:r>
+        <w:t>un’interfaccia di chat per interrogare</w:t>
+      </w:r>
+      <w:r>
+        <w:t xml:space="preserve"> l’assistente conversazionale</w:t>
+      </w:r>
+      <w:r>
+        <w:t xml:space="preserve"> con risposte contestualizzate.</w:t>
+      </w:r>
+    </w:p>
+    <w:p>
+      <w:pPr>
+        <w:pStyle w:val="ListParagraph"/>
+        <w:numPr>
+          <w:ilvl w:val="0"/>
+          <w:numId w:val="9"/>
+        </w:numPr>
+      </w:pPr>
+      <w:r>
+        <w:t xml:space="preserve">Predisporre la configurazione di un LLM </w:t>
+      </w:r>
+      <w:r>
+        <w:t xml:space="preserve">in </w:t>
+      </w:r>
+      <w:r>
+        <w:t xml:space="preserve">cloud </w:t>
+      </w:r>
+      <w:r>
+        <w:t xml:space="preserve">per </w:t>
+      </w:r>
+      <w:r>
+        <w:t>una futura espansione.</w:t>
+      </w:r>
+    </w:p>
+    <w:p>
+      <w:pPr>
+        <w:ind w:left="360"/>
+      </w:pPr>
+    </w:p>
+    <w:p>
+      <w:pPr>
+        <w:pStyle w:val="Heading2"/>
+        <w:numPr>
+          <w:ilvl w:val="1"/>
+          <w:numId w:val="5"/>
+        </w:numPr>
+      </w:pPr>
+      <w:bookmarkStart w:id="5" w:name="_Toc458841592"/>
+      <w:r>
+        <w:t>Obiettivi e Criteri di Successo</w:t>
+      </w:r>
+      <w:bookmarkEnd w:id="5"/>
+    </w:p>
+    <w:p>
+      <w:r>
+        <w:t xml:space="preserve">L’obiettivo </w:t>
+      </w:r>
+      <w:r>
+        <w:t xml:space="preserve">del progetto è la realizzazione di un’applicazione </w:t>
+      </w:r>
+      <w:r>
+        <w:t xml:space="preserve">desktop-based </w:t>
+      </w:r>
+      <w:r>
+        <w:t>di supporto</w:t>
+      </w:r>
+      <w:r>
+        <w:t xml:space="preserve"> a lettori assidui di notizie, professionisti e studenti universitari.</w:t>
+      </w:r>
+    </w:p>
+    <w:p>
+      <w:r>
+        <w:t>Gli scopi principali sono</w:t>
+      </w:r>
+      <w:r>
+        <w:t xml:space="preserve"> l’aggregazione, </w:t>
+      </w:r>
+      <w:r>
+        <w:t xml:space="preserve">la </w:t>
+      </w:r>
+      <w:r>
+        <w:t xml:space="preserve">profilazione e </w:t>
+      </w:r>
+      <w:r>
+        <w:t>l’</w:t>
+      </w:r>
+      <w:r>
+        <w:t>interrogazione conversazionale</w:t>
+      </w:r>
+      <w:r>
+        <w:t xml:space="preserve"> </w:t>
+      </w:r>
+      <w:r>
+        <w:t xml:space="preserve">in base agli interessi degli </w:t>
+      </w:r>
+      <w:r>
+        <w:t xml:space="preserve">iscritti, permettendo – inoltre </w:t>
+      </w:r>
+      <w:r>
+        <w:t>–</w:t>
+      </w:r>
+      <w:r>
+        <w:t xml:space="preserve"> </w:t>
+      </w:r>
+      <w:r>
+        <w:t xml:space="preserve">all’utenza esperta di </w:t>
+      </w:r>
+      <w:r>
+        <w:t>aggiungere note</w:t>
+      </w:r>
+      <w:r>
+        <w:t>, pareri ed approfondimenti utili.</w:t>
+      </w:r>
+    </w:p>
+    <w:p>
+      <w:r>
+        <w:t>I criteri di successo stabiliti sono:</w:t>
+      </w:r>
+    </w:p>
+    <w:p>
+      <w:pPr>
+        <w:pStyle w:val="ListParagraph"/>
+        <w:numPr>
+          <w:ilvl w:val="0"/>
+          <w:numId w:val="11"/>
+        </w:numPr>
+      </w:pPr>
       <w:r>
         <w:rPr>
           <w:i/>
           <w:iCs/>
         </w:rPr>
-        <w:t>overloaded</w:t>
-      </w:r>
-      <w:proofErr w:type="spellEnd"/>
-      <w:r>
-        <w:t xml:space="preserve"> (sovraccarico informativo) causato da un’eccessiva fruizione di informazioni da diverse testate giornalistiche e/o canali di informazione. </w:t>
-      </w:r>
-      <w:r>
-        <w:br/>
-      </w:r>
-      <w:r>
-        <w:t xml:space="preserve">Il progetto FARIS nasce dall’idea di aiutare gli utenti a migliorare la fruibilità delle notizie di loro interesse, tramite un’applicazione desktop </w:t>
-      </w:r>
-      <w:proofErr w:type="gramStart"/>
-      <w:r>
-        <w:t>multi-utente</w:t>
-      </w:r>
-      <w:proofErr w:type="gramEnd"/>
-      <w:r>
-        <w:t xml:space="preserve"> per la gestione, l’aggregazione e fruizione personalizzata di informazioni e notizie provenienti da fonti giornalistiche online. Il sistema deve supportare:</w:t>
-      </w:r>
-    </w:p>
-    <w:p>
-      <w:pPr>
-        <w:pStyle w:val="Paragrafoelenco"/>
+        <w:t>Facilità d’uso</w:t>
+      </w:r>
+      <w:r>
+        <w:t>: il sistema deve permettere ad un nuovo utente di completare l’intero processo di regi</w:t>
+      </w:r>
+      <w:r>
+        <w:t>strazione, profilazione e fruizione,</w:t>
+      </w:r>
+      <w:r>
+        <w:t xml:space="preserve"> in autonomia e senza la necessità di </w:t>
+      </w:r>
+      <w:r>
+        <w:t>consultare documentazioni esterne.</w:t>
+      </w:r>
+    </w:p>
+    <w:p>
+      <w:pPr>
+        <w:pStyle w:val="ListParagraph"/>
         <w:numPr>
           <w:ilvl w:val="0"/>
-          <w:numId w:val="6"/>
-        </w:numPr>
-        <w:jc w:val="both"/>
-      </w:pPr>
-      <w:r>
-        <w:t>La registrazione, autenticazione e gestione di profili distinti;</w:t>
-      </w:r>
-    </w:p>
-    <w:p>
-      <w:pPr>
-        <w:pStyle w:val="Paragrafoelenco"/>
-        <w:numPr>
-          <w:ilvl w:val="0"/>
-          <w:numId w:val="6"/>
-        </w:numPr>
-        <w:jc w:val="both"/>
-      </w:pPr>
-      <w:r>
-        <w:t>La definizione ed aggiornamento delle preferenze e tematiche di interesse dell’utente;</w:t>
-      </w:r>
-    </w:p>
-    <w:p>
-      <w:pPr>
-        <w:pStyle w:val="Paragrafoelenco"/>
-        <w:numPr>
-          <w:ilvl w:val="0"/>
-          <w:numId w:val="6"/>
-        </w:numPr>
-        <w:jc w:val="both"/>
-      </w:pPr>
-      <w:r>
-        <w:t xml:space="preserve">Gestione del download e </w:t>
-      </w:r>
-      <w:proofErr w:type="spellStart"/>
-      <w:r>
-        <w:t>parsing</w:t>
-      </w:r>
-      <w:proofErr w:type="spellEnd"/>
-      <w:r>
-        <w:t xml:space="preserve"> asincrono periodico dalle sorgenti di feed RSS;</w:t>
-      </w:r>
-    </w:p>
-    <w:p>
-      <w:pPr>
-        <w:pStyle w:val="Paragrafoelenco"/>
-        <w:numPr>
-          <w:ilvl w:val="0"/>
-          <w:numId w:val="6"/>
-        </w:numPr>
-        <w:jc w:val="both"/>
-      </w:pPr>
-      <w:r>
-        <w:t>Indicizzazione e visualizzazione filtrata degli articoli in base alle preferenze dell’utente autenticato.</w:t>
-      </w:r>
-    </w:p>
-    <w:p>
-      <w:pPr>
-        <w:pStyle w:val="Paragrafoelenco"/>
-        <w:numPr>
-          <w:ilvl w:val="0"/>
-          <w:numId w:val="6"/>
-        </w:numPr>
-        <w:jc w:val="both"/>
-      </w:pPr>
-      <w:r>
-        <w:t>Interrogazione tramite linguaggio naturale di un assistente conversazionale locale.</w:t>
-      </w:r>
-    </w:p>
-    <w:p>
-      <w:pPr>
-        <w:jc w:val="both"/>
-      </w:pPr>
-    </w:p>
-    <w:p>
-      <w:pPr>
-        <w:pStyle w:val="Titolo2"/>
-        <w:numPr>
-          <w:ilvl w:val="1"/>
-          <w:numId w:val="1"/>
-        </w:numPr>
-      </w:pPr>
-      <w:bookmarkStart w:id="4" w:name="_Toc243074480"/>
-      <w:r>
-        <w:t>Ambito</w:t>
-      </w:r>
-      <w:r>
-        <w:t xml:space="preserve"> del Sistema</w:t>
-      </w:r>
-      <w:bookmarkEnd w:id="4"/>
-    </w:p>
-    <w:p>
-      <w:r>
-        <w:t xml:space="preserve">L’applicazione </w:t>
-      </w:r>
-      <w:r>
-        <w:t>sarà sviluppata</w:t>
-      </w:r>
-      <w:r>
-        <w:t xml:space="preserve"> </w:t>
-      </w:r>
-      <w:r>
-        <w:t xml:space="preserve">per </w:t>
-      </w:r>
-      <w:r>
-        <w:t>supportare lettori assidui di notizie, professionisti e studenti universitari</w:t>
-      </w:r>
-      <w:r>
-        <w:t xml:space="preserve"> nella fruizione di molteplic</w:t>
-      </w:r>
-      <w:r>
-        <w:t xml:space="preserve">i fonti di informazioni digitali, </w:t>
-      </w:r>
-      <w:r>
-        <w:t>contrastando il fenomeno del sovraccarico informativo.</w:t>
-      </w:r>
-    </w:p>
-    <w:p>
-      <w:r>
-        <w:t>L’applicazione permetterà agli utenti di registrarsi e personalizzare la propria esperienza</w:t>
-      </w:r>
-      <w:r>
-        <w:t xml:space="preserve"> mediante </w:t>
-      </w:r>
-      <w:r>
-        <w:t>una profilazione iniziale basata su tag tematici e interessi</w:t>
-      </w:r>
-      <w:r>
-        <w:t>,</w:t>
-      </w:r>
-      <w:r>
-        <w:t xml:space="preserve"> visualizzando una bacheca filtrata che evidenzi solo articoli effettivamente pertinenti alle loro preferen</w:t>
-      </w:r>
-      <w:r>
-        <w:t>ze</w:t>
-      </w:r>
-      <w:r>
-        <w:t>.</w:t>
-      </w:r>
-    </w:p>
-    <w:p>
-      <w:r>
-        <w:t xml:space="preserve">L’applicazione </w:t>
-      </w:r>
-      <w:r>
-        <w:t xml:space="preserve">permetterà di </w:t>
-      </w:r>
-      <w:r>
-        <w:t>aggiungere, validare e gestire liberamente le fonti</w:t>
-      </w:r>
-      <w:r>
-        <w:t xml:space="preserve">, </w:t>
-      </w:r>
-      <w:r>
-        <w:t xml:space="preserve">a partire da un catalogo </w:t>
-      </w:r>
-      <w:r>
-        <w:t xml:space="preserve">predeterminato </w:t>
-      </w:r>
-      <w:r>
-        <w:t xml:space="preserve">– e </w:t>
-      </w:r>
-      <w:r>
-        <w:t>verificate</w:t>
-      </w:r>
-      <w:r>
-        <w:t xml:space="preserve"> </w:t>
-      </w:r>
-      <w:r>
-        <w:t>-,</w:t>
-      </w:r>
-      <w:r>
-        <w:t xml:space="preserve"> eseguendo </w:t>
-      </w:r>
-      <w:r>
-        <w:t>il periodico download asincrono</w:t>
-      </w:r>
-      <w:r>
-        <w:t xml:space="preserve"> dei contenuti.</w:t>
-      </w:r>
-    </w:p>
-    <w:p>
-      <w:r>
-        <w:t>L’applicazione permetterà agli utenti con ruolo esperto di arricchire le notizie aggiungendo delle note di analisi</w:t>
-      </w:r>
-      <w:r>
-        <w:t>, fornendo un approfondimento visibile agli altri lettori</w:t>
-      </w:r>
-      <w:r>
-        <w:t>, differenziato dal flusso standard dell’informazione.</w:t>
-      </w:r>
-    </w:p>
-    <w:p>
-      <w:r>
-        <w:t>Inoltre,</w:t>
-      </w:r>
-      <w:r>
-        <w:t xml:space="preserve"> il sistema integra un assistente conversazionale</w:t>
-      </w:r>
-      <w:r>
-        <w:t xml:space="preserve"> che permetterà agli utenti di porre domande in linguaggio naturale</w:t>
-      </w:r>
-      <w:r>
-        <w:t xml:space="preserve"> -</w:t>
-      </w:r>
-      <w:r>
-        <w:t xml:space="preserve"> </w:t>
-      </w:r>
-      <w:proofErr w:type="gramStart"/>
-      <w:r>
-        <w:t>come ad esempio</w:t>
-      </w:r>
-      <w:proofErr w:type="gramEnd"/>
-      <w:r>
-        <w:t xml:space="preserve"> le principali novità della settimana su specifici argomenti</w:t>
-      </w:r>
-      <w:r>
-        <w:t xml:space="preserve"> -,</w:t>
-      </w:r>
-      <w:r>
-        <w:t xml:space="preserve"> generando risposte sintetiche e verificate</w:t>
-      </w:r>
-      <w:r>
-        <w:t>.</w:t>
-      </w:r>
-    </w:p>
-    <w:p>
-      <w:r>
-        <w:t>Nel dettaglio le funzionalità sono:</w:t>
-      </w:r>
-    </w:p>
-    <w:p>
-      <w:pPr>
-        <w:pStyle w:val="Paragrafoelenco"/>
-        <w:numPr>
-          <w:ilvl w:val="0"/>
-          <w:numId w:val="5"/>
-        </w:numPr>
-      </w:pPr>
-      <w:r>
-        <w:t>Consentire ad un utente di registrarsi alla piattaforma e impostando le proprie preferenze e categorie tematiche di interesse.</w:t>
-      </w:r>
-    </w:p>
-    <w:p>
-      <w:pPr>
-        <w:pStyle w:val="Paragrafoelenco"/>
-        <w:numPr>
-          <w:ilvl w:val="0"/>
-          <w:numId w:val="5"/>
-        </w:numPr>
-      </w:pPr>
-      <w:r>
-        <w:lastRenderedPageBreak/>
-        <w:t xml:space="preserve">Consentire agli utenti </w:t>
-      </w:r>
-      <w:r>
-        <w:t>con token di</w:t>
-      </w:r>
-      <w:r>
-        <w:t xml:space="preserve"> convalida di ottenere il ruolo di utente esperto.</w:t>
-      </w:r>
-    </w:p>
-    <w:p>
-      <w:pPr>
-        <w:pStyle w:val="Paragrafoelenco"/>
-        <w:numPr>
-          <w:ilvl w:val="0"/>
-          <w:numId w:val="5"/>
-        </w:numPr>
-      </w:pPr>
-      <w:r>
-        <w:t>Consentire la gestione delle sorgenti informative tramite l’inserimento</w:t>
-      </w:r>
-      <w:r>
-        <w:t xml:space="preserve">, la modifica e l’eliminazione </w:t>
-      </w:r>
-      <w:r>
-        <w:t>dei canali non più desiderati</w:t>
-      </w:r>
-      <w:r>
-        <w:t>.</w:t>
-      </w:r>
-    </w:p>
-    <w:p>
-      <w:pPr>
-        <w:pStyle w:val="Paragrafoelenco"/>
-        <w:numPr>
-          <w:ilvl w:val="0"/>
-          <w:numId w:val="5"/>
-        </w:numPr>
-      </w:pPr>
-      <w:r>
-        <w:t>Consentire la gestione</w:t>
-      </w:r>
-      <w:r>
-        <w:t xml:space="preserve"> delle tematiche di interesse tramite l’inserimento</w:t>
-      </w:r>
-      <w:r>
-        <w:t xml:space="preserve"> </w:t>
-      </w:r>
-      <w:r>
-        <w:t>e la modifica delle</w:t>
-      </w:r>
-      <w:r>
-        <w:t xml:space="preserve"> stesse.</w:t>
-      </w:r>
-    </w:p>
-    <w:p>
-      <w:pPr>
-        <w:pStyle w:val="Paragrafoelenco"/>
-        <w:numPr>
-          <w:ilvl w:val="0"/>
-          <w:numId w:val="5"/>
-        </w:numPr>
-      </w:pPr>
-      <w:r>
-        <w:t xml:space="preserve">Sincronizzare periodicamente </w:t>
-      </w:r>
-      <w:r>
-        <w:t>i contenuti dei feed</w:t>
-      </w:r>
-      <w:r>
-        <w:t>.</w:t>
-      </w:r>
-    </w:p>
-    <w:p>
-      <w:pPr>
-        <w:pStyle w:val="Paragrafoelenco"/>
-        <w:numPr>
-          <w:ilvl w:val="0"/>
-          <w:numId w:val="5"/>
-        </w:numPr>
-      </w:pPr>
-      <w:r>
-        <w:t>Consentire la visualizzazione e consultazione della bacheca articoli filtrata in base al profilo dell’utente autenticato.</w:t>
-      </w:r>
-    </w:p>
-    <w:p>
-      <w:pPr>
-        <w:pStyle w:val="Paragrafoelenco"/>
-        <w:numPr>
-          <w:ilvl w:val="0"/>
-          <w:numId w:val="5"/>
-        </w:numPr>
-      </w:pPr>
-      <w:r>
-        <w:t xml:space="preserve">Consentire agli utenti esperti di </w:t>
-      </w:r>
-      <w:r>
-        <w:t>aggiungere e modificare</w:t>
-      </w:r>
-      <w:r>
-        <w:t xml:space="preserve"> note editoriali, pareri e approfondimenti a specifici articoli.</w:t>
-      </w:r>
-    </w:p>
-    <w:p>
-      <w:pPr>
-        <w:pStyle w:val="Paragrafoelenco"/>
-        <w:numPr>
-          <w:ilvl w:val="0"/>
-          <w:numId w:val="5"/>
-        </w:numPr>
-      </w:pPr>
-      <w:r>
-        <w:t xml:space="preserve">Fornire </w:t>
-      </w:r>
-      <w:r>
-        <w:t>un’interfaccia di chat per interrogare</w:t>
-      </w:r>
-      <w:r>
-        <w:t xml:space="preserve"> l’assistente conversazionale</w:t>
-      </w:r>
-      <w:r>
-        <w:t xml:space="preserve"> con risposte contestualizzate.</w:t>
-      </w:r>
-    </w:p>
-    <w:p>
-      <w:pPr>
-        <w:pStyle w:val="Paragrafoelenco"/>
-        <w:numPr>
-          <w:ilvl w:val="0"/>
-          <w:numId w:val="5"/>
-        </w:numPr>
-      </w:pPr>
-      <w:r>
-        <w:t xml:space="preserve">Predisporre la configurazione di un LLM </w:t>
-      </w:r>
-      <w:r>
-        <w:t xml:space="preserve">in </w:t>
-      </w:r>
-      <w:r>
-        <w:t xml:space="preserve">cloud </w:t>
-      </w:r>
-      <w:r>
-        <w:t xml:space="preserve">per </w:t>
-      </w:r>
-      <w:r>
-        <w:t>una futura espansione.</w:t>
-      </w:r>
-    </w:p>
-    <w:p>
-      <w:pPr>
-        <w:ind w:left="360"/>
-      </w:pPr>
-    </w:p>
-    <w:p>
-      <w:pPr>
-        <w:pStyle w:val="Titolo2"/>
-        <w:numPr>
-          <w:ilvl w:val="1"/>
-          <w:numId w:val="1"/>
-        </w:numPr>
-      </w:pPr>
-      <w:bookmarkStart w:id="5" w:name="_Toc243074481"/>
-      <w:r>
-        <w:t>Obiettivi e Criteri di Successo</w:t>
-      </w:r>
-      <w:bookmarkEnd w:id="5"/>
-    </w:p>
-    <w:p>
-      <w:r>
-        <w:t xml:space="preserve">L’obiettivo </w:t>
-      </w:r>
-      <w:r>
-        <w:t xml:space="preserve">del progetto è la realizzazione di un’applicazione </w:t>
-      </w:r>
-      <w:r>
-        <w:t>desktop-</w:t>
-      </w:r>
-      <w:proofErr w:type="spellStart"/>
-      <w:r>
-        <w:t>based</w:t>
-      </w:r>
-      <w:proofErr w:type="spellEnd"/>
-      <w:r>
-        <w:t xml:space="preserve"> </w:t>
-      </w:r>
-      <w:r>
-        <w:t>di supporto</w:t>
-      </w:r>
-      <w:r>
-        <w:t xml:space="preserve"> a lettori assidui di notizie, professionisti e studenti universitari.</w:t>
-      </w:r>
-    </w:p>
-    <w:p>
-      <w:r>
-        <w:t>Gli scopi principali sono</w:t>
-      </w:r>
-      <w:r>
-        <w:t xml:space="preserve"> l’aggregazione, </w:t>
-      </w:r>
-      <w:r>
-        <w:t xml:space="preserve">la </w:t>
-      </w:r>
-      <w:r>
-        <w:t xml:space="preserve">profilazione e </w:t>
-      </w:r>
-      <w:r>
-        <w:t>l’</w:t>
-      </w:r>
-      <w:r>
-        <w:t>interrogazione conversazionale</w:t>
-      </w:r>
-      <w:r>
-        <w:t xml:space="preserve"> </w:t>
-      </w:r>
-      <w:r>
-        <w:t xml:space="preserve">in base agli interessi degli </w:t>
-      </w:r>
-      <w:r>
-        <w:t xml:space="preserve">iscritti, permettendo – inoltre </w:t>
-      </w:r>
-      <w:r>
-        <w:t>–</w:t>
-      </w:r>
-      <w:r>
-        <w:t xml:space="preserve"> </w:t>
-      </w:r>
-      <w:r>
-        <w:t xml:space="preserve">all’utenza esperta di </w:t>
-      </w:r>
-      <w:r>
-        <w:t>aggiungere note</w:t>
-      </w:r>
-      <w:r>
-        <w:t>, pareri ed approfondimenti utili.</w:t>
-      </w:r>
-    </w:p>
-    <w:p>
-      <w:r>
-        <w:t>I criteri di successo stabiliti sono:</w:t>
-      </w:r>
-    </w:p>
-    <w:p>
-      <w:pPr>
-        <w:pStyle w:val="Paragrafoelenco"/>
-        <w:numPr>
-          <w:ilvl w:val="0"/>
-          <w:numId w:val="7"/>
-        </w:numPr>
-      </w:pPr>
-      <w:r>
-        <w:rPr>
-          <w:i/>
-          <w:iCs/>
-        </w:rPr>
-        <w:t>Efficienza nell’apprendimento</w:t>
-      </w:r>
-      <w:r>
-        <w:t>: il sistema deve permettere ad un nuovo utente di completare l’intero processo di regi</w:t>
-      </w:r>
-      <w:r>
-        <w:t>strazione, profilazione e fruizione,</w:t>
-      </w:r>
-      <w:r>
-        <w:t xml:space="preserve"> in autonomia e senza la necessità di </w:t>
-      </w:r>
-      <w:r>
-        <w:t>consultare documentazioni esterne.</w:t>
-      </w:r>
-    </w:p>
-    <w:p>
-      <w:pPr>
-        <w:pStyle w:val="Paragrafoelenco"/>
-        <w:numPr>
-          <w:ilvl w:val="0"/>
-          <w:numId w:val="7"/>
+          <w:numId w:val="11"/>
         </w:numPr>
       </w:pPr>
       <w:r>
@@ -2503,10 +2277,10 @@
     </w:p>
     <w:p>
       <w:pPr>
-        <w:pStyle w:val="Paragrafoelenco"/>
+        <w:pStyle w:val="ListParagraph"/>
         <w:numPr>
           <w:ilvl w:val="0"/>
-          <w:numId w:val="7"/>
+          <w:numId w:val="11"/>
         </w:numPr>
       </w:pPr>
       <w:r>
@@ -2541,10 +2315,10 @@
     </w:p>
     <w:p>
       <w:pPr>
-        <w:pStyle w:val="Paragrafoelenco"/>
+        <w:pStyle w:val="ListParagraph"/>
         <w:numPr>
           <w:ilvl w:val="0"/>
-          <w:numId w:val="7"/>
+          <w:numId w:val="11"/>
         </w:numPr>
       </w:pPr>
       <w:r>
@@ -2569,10 +2343,10 @@
     </w:p>
     <w:p>
       <w:pPr>
-        <w:pStyle w:val="Paragrafoelenco"/>
+        <w:pStyle w:val="ListParagraph"/>
         <w:numPr>
           <w:ilvl w:val="0"/>
-          <w:numId w:val="7"/>
+          <w:numId w:val="11"/>
         </w:numPr>
       </w:pPr>
       <w:r>
@@ -2604,10 +2378,10 @@
     </w:p>
     <w:p>
       <w:pPr>
-        <w:pStyle w:val="Paragrafoelenco"/>
+        <w:pStyle w:val="ListParagraph"/>
         <w:numPr>
           <w:ilvl w:val="0"/>
-          <w:numId w:val="7"/>
+          <w:numId w:val="11"/>
         </w:numPr>
       </w:pPr>
       <w:r>
@@ -2621,6 +2395,482 @@
         <w:t>: si intende rispettare le scadenze prefissate con il cliente.</w:t>
       </w:r>
     </w:p>
+    <w:p/>
+    <w:p>
+      <w:pPr>
+        <w:pStyle w:val="Heading2"/>
+        <w:spacing w:before="0" w:after="0" w:line="276" w:lineRule="auto"/>
+        <w:ind w:left="708" w:hanging="708"/>
+        <w:rPr>
+          <w:rFonts w:ascii="Aptos Display" w:eastAsia="Aptos Display" w:hAnsi="Aptos Display" w:cs="Aptos Display"/>
+        </w:rPr>
+      </w:pPr>
+      <w:bookmarkStart w:id="6" w:name="_Toc1808229420"/>
+      <w:bookmarkStart w:id="7" w:name="_Toc2075145779"/>
+      <w:r>
+        <w:rPr>
+          <w:rFonts w:ascii="Aptos Display" w:eastAsia="Aptos Display" w:hAnsi="Aptos Display" w:cs="Aptos Display"/>
+        </w:rPr>
+        <w:t xml:space="preserve">1.4 </w:t>
+      </w:r>
+      <w:r>
+        <w:tab/>
+      </w:r>
+      <w:r>
+        <w:rPr>
+          <w:rFonts w:ascii="Aptos Display" w:eastAsia="Aptos Display" w:hAnsi="Aptos Display" w:cs="Aptos Display"/>
+        </w:rPr>
+        <w:t>Definizioni, Acronimi e Abbreviazioni</w:t>
+      </w:r>
+      <w:bookmarkEnd w:id="6"/>
+      <w:bookmarkEnd w:id="7"/>
+      <w:r>
+        <w:rPr>
+          <w:rFonts w:ascii="Aptos Display" w:eastAsia="Aptos Display" w:hAnsi="Aptos Display" w:cs="Aptos Display"/>
+        </w:rPr>
+        <w:t xml:space="preserve"> </w:t>
+      </w:r>
+    </w:p>
+    <w:p>
+      <w:pPr>
+        <w:spacing w:line="276" w:lineRule="auto"/>
+      </w:pPr>
+      <w:r>
+        <w:rPr>
+          <w:rFonts w:eastAsia="Calibri"/>
+        </w:rPr>
+        <w:t>Di seguito una lista di definizioni, acronimi, e abbreviazioni:</w:t>
+      </w:r>
+    </w:p>
+    <w:p>
+      <w:pPr>
+        <w:pStyle w:val="ListParagraph"/>
+        <w:numPr>
+          <w:ilvl w:val="2"/>
+          <w:numId w:val="3"/>
+        </w:numPr>
+        <w:spacing w:after="0" w:line="276" w:lineRule="auto"/>
+        <w:ind w:left="853"/>
+        <w:rPr>
+          <w:rFonts w:eastAsia="Calibri"/>
+        </w:rPr>
+      </w:pPr>
+      <w:r>
+        <w:rPr>
+          <w:rFonts w:eastAsia="Calibri"/>
+          <w:b/>
+          <w:bCs/>
+        </w:rPr>
+        <w:t>GU</w:t>
+      </w:r>
+      <w:r>
+        <w:rPr>
+          <w:rFonts w:eastAsia="Calibri"/>
+        </w:rPr>
+        <w:t>: Gestione Utente</w:t>
+      </w:r>
+    </w:p>
+    <w:p>
+      <w:pPr>
+        <w:pStyle w:val="ListParagraph"/>
+        <w:numPr>
+          <w:ilvl w:val="2"/>
+          <w:numId w:val="3"/>
+        </w:numPr>
+        <w:spacing w:after="0" w:line="276" w:lineRule="auto"/>
+        <w:ind w:left="853"/>
+        <w:rPr>
+          <w:rFonts w:eastAsia="Calibri"/>
+        </w:rPr>
+      </w:pPr>
+      <w:r>
+        <w:rPr>
+          <w:rFonts w:eastAsia="Calibri"/>
+          <w:b/>
+          <w:bCs/>
+        </w:rPr>
+        <w:t>AD</w:t>
+      </w:r>
+      <w:r>
+        <w:rPr>
+          <w:rFonts w:eastAsia="Calibri"/>
+        </w:rPr>
+        <w:t>: Activity Diagram</w:t>
+      </w:r>
+    </w:p>
+    <w:p>
+      <w:pPr>
+        <w:pStyle w:val="ListParagraph"/>
+        <w:numPr>
+          <w:ilvl w:val="2"/>
+          <w:numId w:val="3"/>
+        </w:numPr>
+        <w:spacing w:after="0" w:line="276" w:lineRule="auto"/>
+        <w:ind w:left="853"/>
+        <w:rPr>
+          <w:rFonts w:eastAsia="Calibri"/>
+        </w:rPr>
+      </w:pPr>
+      <w:r>
+        <w:rPr>
+          <w:rFonts w:eastAsia="Calibri"/>
+          <w:b/>
+          <w:bCs/>
+        </w:rPr>
+        <w:t>RAD</w:t>
+      </w:r>
+      <w:r>
+        <w:rPr>
+          <w:rFonts w:eastAsia="Calibri"/>
+        </w:rPr>
+        <w:t>: Requirements Analysis Document</w:t>
+      </w:r>
+    </w:p>
+    <w:p>
+      <w:pPr>
+        <w:pStyle w:val="ListParagraph"/>
+        <w:numPr>
+          <w:ilvl w:val="2"/>
+          <w:numId w:val="3"/>
+        </w:numPr>
+        <w:spacing w:after="0" w:line="276" w:lineRule="auto"/>
+        <w:ind w:left="853"/>
+        <w:rPr>
+          <w:rFonts w:eastAsia="Calibri"/>
+        </w:rPr>
+      </w:pPr>
+      <w:r>
+        <w:rPr>
+          <w:rFonts w:eastAsia="Calibri"/>
+          <w:b/>
+          <w:bCs/>
+        </w:rPr>
+        <w:t>SDD</w:t>
+      </w:r>
+      <w:r>
+        <w:rPr>
+          <w:rFonts w:eastAsia="Calibri"/>
+        </w:rPr>
+        <w:t>: System Design Document</w:t>
+      </w:r>
+    </w:p>
+    <w:p>
+      <w:pPr>
+        <w:pStyle w:val="ListParagraph"/>
+        <w:numPr>
+          <w:ilvl w:val="2"/>
+          <w:numId w:val="3"/>
+        </w:numPr>
+        <w:spacing w:after="0" w:line="276" w:lineRule="auto"/>
+        <w:ind w:left="853"/>
+        <w:rPr>
+          <w:rFonts w:eastAsia="Calibri"/>
+        </w:rPr>
+      </w:pPr>
+      <w:r>
+        <w:rPr>
+          <w:rFonts w:eastAsia="Calibri"/>
+          <w:b/>
+          <w:bCs/>
+        </w:rPr>
+        <w:t>WBS</w:t>
+      </w:r>
+      <w:r>
+        <w:rPr>
+          <w:rFonts w:eastAsia="Calibri"/>
+        </w:rPr>
+        <w:t>: Work Breakdown Structure</w:t>
+      </w:r>
+    </w:p>
+    <w:p>
+      <w:pPr>
+        <w:pStyle w:val="ListParagraph"/>
+        <w:numPr>
+          <w:ilvl w:val="2"/>
+          <w:numId w:val="3"/>
+        </w:numPr>
+        <w:spacing w:after="0" w:line="276" w:lineRule="auto"/>
+        <w:ind w:left="853"/>
+        <w:rPr>
+          <w:rFonts w:eastAsia="Calibri"/>
+        </w:rPr>
+      </w:pPr>
+      <w:r>
+        <w:rPr>
+          <w:rFonts w:eastAsia="Calibri"/>
+          <w:b/>
+          <w:bCs/>
+        </w:rPr>
+        <w:t>SD</w:t>
+      </w:r>
+      <w:r>
+        <w:rPr>
+          <w:rFonts w:eastAsia="Calibri"/>
+        </w:rPr>
+        <w:t>: Sequence Diagram</w:t>
+      </w:r>
+    </w:p>
+    <w:p>
+      <w:pPr>
+        <w:pStyle w:val="ListParagraph"/>
+        <w:numPr>
+          <w:ilvl w:val="2"/>
+          <w:numId w:val="3"/>
+        </w:numPr>
+        <w:spacing w:after="0" w:line="276" w:lineRule="auto"/>
+        <w:ind w:left="853"/>
+        <w:rPr>
+          <w:rFonts w:eastAsia="Calibri"/>
+        </w:rPr>
+      </w:pPr>
+      <w:r>
+        <w:rPr>
+          <w:rFonts w:eastAsia="Calibri"/>
+          <w:b/>
+          <w:bCs/>
+        </w:rPr>
+        <w:t>RNF</w:t>
+      </w:r>
+      <w:r>
+        <w:rPr>
+          <w:rFonts w:eastAsia="Calibri"/>
+        </w:rPr>
+        <w:t>: Requisito Non Funzionale</w:t>
+      </w:r>
+    </w:p>
+    <w:p>
+      <w:pPr>
+        <w:pStyle w:val="ListParagraph"/>
+        <w:numPr>
+          <w:ilvl w:val="2"/>
+          <w:numId w:val="3"/>
+        </w:numPr>
+        <w:spacing w:after="0" w:line="276" w:lineRule="auto"/>
+        <w:ind w:left="853"/>
+        <w:rPr>
+          <w:rFonts w:eastAsia="Calibri"/>
+        </w:rPr>
+      </w:pPr>
+      <w:r>
+        <w:rPr>
+          <w:rFonts w:eastAsia="Calibri"/>
+          <w:b/>
+          <w:bCs/>
+        </w:rPr>
+        <w:t>RF</w:t>
+      </w:r>
+      <w:r>
+        <w:rPr>
+          <w:rFonts w:eastAsia="Calibri"/>
+        </w:rPr>
+        <w:t>: Requisito Funzionale</w:t>
+      </w:r>
+    </w:p>
+    <w:p/>
+    <w:p>
+      <w:pPr>
+        <w:pStyle w:val="Heading2"/>
+        <w:spacing w:before="0" w:after="0" w:line="276" w:lineRule="auto"/>
+        <w:ind w:left="708" w:hanging="708"/>
+        <w:rPr>
+          <w:rFonts w:ascii="Aptos Display" w:eastAsia="Aptos Display" w:hAnsi="Aptos Display" w:cs="Aptos Display"/>
+        </w:rPr>
+      </w:pPr>
+      <w:bookmarkStart w:id="8" w:name="_Toc810292790"/>
+      <w:bookmarkStart w:id="9" w:name="_Toc1813775564"/>
+      <w:r>
+        <w:rPr>
+          <w:rFonts w:ascii="Aptos Display" w:eastAsia="Aptos Display" w:hAnsi="Aptos Display" w:cs="Aptos Display"/>
+        </w:rPr>
+        <w:t xml:space="preserve">1.5 </w:t>
+      </w:r>
+      <w:r>
+        <w:tab/>
+      </w:r>
+      <w:r>
+        <w:rPr>
+          <w:rFonts w:ascii="Aptos Display" w:eastAsia="Aptos Display" w:hAnsi="Aptos Display" w:cs="Aptos Display"/>
+        </w:rPr>
+        <w:t>Riferimenti</w:t>
+      </w:r>
+      <w:bookmarkEnd w:id="8"/>
+      <w:bookmarkEnd w:id="9"/>
+    </w:p>
+    <w:p>
+      <w:pPr>
+        <w:spacing w:line="276" w:lineRule="auto"/>
+      </w:pPr>
+      <w:r>
+        <w:rPr>
+          <w:rFonts w:eastAsia="Calibri"/>
+        </w:rPr>
+        <w:t xml:space="preserve"> </w:t>
+      </w:r>
+    </w:p>
+    <w:p>
+      <w:pPr>
+        <w:pStyle w:val="Heading2"/>
+        <w:spacing w:before="0" w:after="0" w:line="276" w:lineRule="auto"/>
+        <w:ind w:left="708" w:hanging="708"/>
+        <w:rPr>
+          <w:rFonts w:ascii="Aptos Display" w:eastAsia="Aptos Display" w:hAnsi="Aptos Display" w:cs="Aptos Display"/>
+        </w:rPr>
+      </w:pPr>
+      <w:bookmarkStart w:id="10" w:name="_Toc1341300485"/>
+      <w:bookmarkStart w:id="11" w:name="_Toc25628081"/>
+      <w:r>
+        <w:rPr>
+          <w:rFonts w:ascii="Aptos Display" w:eastAsia="Aptos Display" w:hAnsi="Aptos Display" w:cs="Aptos Display"/>
+        </w:rPr>
+        <w:t xml:space="preserve">1.6 </w:t>
+      </w:r>
+      <w:r>
+        <w:tab/>
+      </w:r>
+      <w:r>
+        <w:rPr>
+          <w:rFonts w:ascii="Aptos Display" w:eastAsia="Aptos Display" w:hAnsi="Aptos Display" w:cs="Aptos Display"/>
+        </w:rPr>
+        <w:t>Organizzazione del Documento</w:t>
+      </w:r>
+      <w:bookmarkEnd w:id="10"/>
+      <w:bookmarkEnd w:id="11"/>
+    </w:p>
+    <w:p>
+      <w:pPr>
+        <w:spacing w:line="276" w:lineRule="auto"/>
+      </w:pPr>
+      <w:r>
+        <w:rPr>
+          <w:rFonts w:eastAsia="Calibri"/>
+        </w:rPr>
+        <w:t>Il presente documento è strutturato nel seguente modo:</w:t>
+      </w:r>
+    </w:p>
+    <w:p>
+      <w:pPr>
+        <w:pStyle w:val="ListParagraph"/>
+        <w:numPr>
+          <w:ilvl w:val="0"/>
+          <w:numId w:val="1"/>
+        </w:numPr>
+        <w:spacing w:after="0" w:line="276" w:lineRule="auto"/>
+        <w:ind w:left="853"/>
+        <w:rPr>
+          <w:rFonts w:eastAsia="Calibri"/>
+        </w:rPr>
+      </w:pPr>
+      <w:r>
+        <w:rPr>
+          <w:rFonts w:eastAsia="Calibri"/>
+          <w:b/>
+          <w:bCs/>
+        </w:rPr>
+        <w:t>Introduzione</w:t>
+      </w:r>
+      <w:r>
+        <w:rPr>
+          <w:rFonts w:eastAsia="Calibri"/>
+        </w:rPr>
+        <w:t>: contiene l’obiettivo, l’ambito e i criteri di successo del sistema, oltre a una panoramica su definizioni, acronimi e abbreviazioni utilizzati nel documento.</w:t>
+      </w:r>
+    </w:p>
+    <w:p>
+      <w:pPr>
+        <w:pStyle w:val="ListParagraph"/>
+        <w:numPr>
+          <w:ilvl w:val="0"/>
+          <w:numId w:val="1"/>
+        </w:numPr>
+        <w:spacing w:after="0" w:line="230" w:lineRule="auto"/>
+        <w:ind w:left="853" w:right="872"/>
+        <w:jc w:val="both"/>
+        <w:rPr>
+          <w:rFonts w:eastAsia="Calibri"/>
+        </w:rPr>
+      </w:pPr>
+      <w:r>
+        <w:rPr>
+          <w:rFonts w:eastAsia="Calibri"/>
+          <w:b/>
+          <w:bCs/>
+        </w:rPr>
+        <w:t>Sistema attuale</w:t>
+      </w:r>
+      <w:r>
+        <w:rPr>
+          <w:rFonts w:eastAsia="Calibri"/>
+        </w:rPr>
+        <w:t>: descrive il funzionamento di un sistema RSS open source attuale tramite Activity Diagram</w:t>
+      </w:r>
+    </w:p>
+    <w:p>
+      <w:pPr>
+        <w:pStyle w:val="ListParagraph"/>
+        <w:numPr>
+          <w:ilvl w:val="0"/>
+          <w:numId w:val="1"/>
+        </w:numPr>
+        <w:spacing w:after="0" w:line="230" w:lineRule="auto"/>
+        <w:ind w:left="853" w:right="872"/>
+        <w:jc w:val="both"/>
+        <w:rPr>
+          <w:rFonts w:eastAsia="Calibri"/>
+        </w:rPr>
+      </w:pPr>
+      <w:r>
+        <w:rPr>
+          <w:rFonts w:eastAsia="Calibri"/>
+          <w:b/>
+          <w:bCs/>
+        </w:rPr>
+        <w:t>Sistema proposto</w:t>
+      </w:r>
+      <w:r>
+        <w:rPr>
+          <w:rFonts w:eastAsia="Calibri"/>
+        </w:rPr>
+        <w:t>: descrive l’architettura e le funzionalità del nuovo software, presentandone i requisiti funzionali e non funzionali. Attraverso scenari e casi d’uso vengono definiti gli attori e le loro interazioni con la nuova applicazione. La struttura concettuale e il comportamento logico sono illustrati mediante il Modello ad Oggetti e il Modello Dinamico. Include, inoltre, la progettazione dell'interfaccia grafica desktop, dettagliata tramite mock-up e percorsi di navigazione (Navigational Path).</w:t>
+      </w:r>
+    </w:p>
+    <w:p>
+      <w:pPr>
+        <w:pStyle w:val="ListParagraph"/>
+        <w:numPr>
+          <w:ilvl w:val="0"/>
+          <w:numId w:val="1"/>
+        </w:numPr>
+        <w:spacing w:after="0"/>
+        <w:ind w:left="853" w:hanging="361"/>
+        <w:jc w:val="both"/>
+        <w:rPr>
+          <w:rFonts w:eastAsia="Calibri"/>
+        </w:rPr>
+      </w:pPr>
+      <w:r>
+        <w:rPr>
+          <w:rFonts w:eastAsia="Calibri"/>
+          <w:b/>
+          <w:bCs/>
+        </w:rPr>
+        <w:t>Glossario</w:t>
+      </w:r>
+      <w:r>
+        <w:rPr>
+          <w:rFonts w:eastAsia="Calibri"/>
+        </w:rPr>
+        <w:t>: descrive i termini tecnici presenti nel RAD.</w:t>
+      </w:r>
+    </w:p>
+    <w:p>
+      <w:pPr>
+        <w:spacing w:line="276" w:lineRule="auto"/>
+        <w:rPr>
+          <w:rFonts w:eastAsia="Calibri"/>
+        </w:rPr>
+      </w:pPr>
+    </w:p>
+    <w:p/>
     <w:sectPr>
       <w:headerReference w:type="default" r:id="rId12"/>
       <w:footerReference w:type="default" r:id="rId13"/>
@@ -2663,9 +2913,9 @@
 <w:ftr xmlns:wpc="http://schemas.microsoft.com/office/word/2010/wordprocessingCanvas" xmlns:cx="http://schemas.microsoft.com/office/drawing/2014/chartex" xmlns:cx1="http://schemas.microsoft.com/office/drawing/2015/9/8/chartex" xmlns:cx2="http://schemas.microsoft.com/office/drawing/2015/10/21/chartex" xmlns:cx3="http://schemas.microsoft.com/office/drawing/2016/5/9/chartex" xmlns:cx4="http://schemas.microsoft.com/office/drawing/2016/5/10/chartex" xmlns:cx5="http://schemas.microsoft.com/office/drawing/2016/5/11/chartex" xmlns:cx6="http://schemas.microsoft.com/office/drawing/2016/5/12/chartex" xmlns:cx7="http://schemas.microsoft.com/office/drawing/2016/5/13/chartex" xmlns:cx8="http://schemas.microsoft.com/office/drawing/2016/5/14/chartex" xmlns:mc="http://schemas.openxmlformats.org/markup-compatibility/2006" xmlns:aink="http://schemas.microsoft.com/office/drawing/2016/ink" xmlns:am3d="http://schemas.microsoft.com/office/drawing/2017/model3d" xmlns:o="urn:schemas-microsoft-com:office:office" xmlns:oel="http://schemas.microsoft.com/office/2019/extlst" xmlns:r="http://schemas.openxmlformats.org/officeDocument/2006/relationships" xmlns:m="http://schemas.openxmlformats.org/officeDocument/2006/math" xmlns:v="urn:schemas-microsoft-com:vml" xmlns:wp14="http://schemas.microsoft.com/office/word/2010/wordprocessingDrawing" xmlns:wp="http://schemas.openxmlformats.org/drawingml/2006/wordprocessingDrawing" xmlns:w10="urn:schemas-microsoft-com:office:word" xmlns:w="http://schemas.openxmlformats.org/wordprocessingml/2006/main" xmlns:w14="http://schemas.microsoft.com/office/word/2010/wordml" xmlns:w15="http://schemas.microsoft.com/office/word/2012/wordml" xmlns:w16cex="http://schemas.microsoft.com/office/word/2018/wordml/cex" xmlns:w16cid="http://schemas.microsoft.com/office/word/2016/wordml/cid" xmlns:w16="http://schemas.microsoft.com/office/word/2018/wordml" xmlns:w16du="http://schemas.microsoft.com/office/word/2023/wordml/word16du" xmlns:w16sdtdh="http://schemas.microsoft.com/office/word/2020/wordml/sdtdatahash" xmlns:w16sdtfl="http://schemas.microsoft.com/office/word/2024/wordml/sdtformatlock" xmlns:w16se="http://schemas.microsoft.com/office/word/2015/wordml/symex" xmlns:wpg="http://schemas.microsoft.com/office/word/2010/wordprocessingGroup" xmlns:wpi="http://schemas.microsoft.com/office/word/2010/wordprocessingInk" xmlns:wne="http://schemas.microsoft.com/office/word/2006/wordml" xmlns:wps="http://schemas.microsoft.com/office/word/2010/wordprocessingShape" mc:Ignorable="w14 w15 w16se w16cid w16 w16cex w16sdtdh w16sdtfl w16du wp14">
   <w:p>
     <w:pPr>
-      <w:pStyle w:val="Pidipagina"/>
+      <w:pStyle w:val="Footer"/>
     </w:pPr>
-    <w:fldSimple w:instr=" FILENAME \* MERGEFORMAT ">
+    <w:fldSimple w:instr="FILENAME \* MERGEFORMAT">
       <w:r>
         <w:rPr>
           <w:noProof/>
@@ -2831,7 +3081,7 @@
 <w:hdr xmlns:wpc="http://schemas.microsoft.com/office/word/2010/wordprocessingCanvas" xmlns:cx="http://schemas.microsoft.com/office/drawing/2014/chartex" xmlns:cx1="http://schemas.microsoft.com/office/drawing/2015/9/8/chartex" xmlns:cx2="http://schemas.microsoft.com/office/drawing/2015/10/21/chartex" xmlns:cx3="http://schemas.microsoft.com/office/drawing/2016/5/9/chartex" xmlns:cx4="http://schemas.microsoft.com/office/drawing/2016/5/10/chartex" xmlns:cx5="http://schemas.microsoft.com/office/drawing/2016/5/11/chartex" xmlns:cx6="http://schemas.microsoft.com/office/drawing/2016/5/12/chartex" xmlns:cx7="http://schemas.microsoft.com/office/drawing/2016/5/13/chartex" xmlns:cx8="http://schemas.microsoft.com/office/drawing/2016/5/14/chartex" xmlns:mc="http://schemas.openxmlformats.org/markup-compatibility/2006" xmlns:aink="http://schemas.microsoft.com/office/drawing/2016/ink" xmlns:am3d="http://schemas.microsoft.com/office/drawing/2017/model3d" xmlns:o="urn:schemas-microsoft-com:office:office" xmlns:oel="http://schemas.microsoft.com/office/2019/extlst" xmlns:r="http://schemas.openxmlformats.org/officeDocument/2006/relationships" xmlns:m="http://schemas.openxmlformats.org/officeDocument/2006/math" xmlns:v="urn:schemas-microsoft-com:vml" xmlns:wp14="http://schemas.microsoft.com/office/word/2010/wordprocessingDrawing" xmlns:wp="http://schemas.openxmlformats.org/drawingml/2006/wordprocessingDrawing" xmlns:w10="urn:schemas-microsoft-com:office:word" xmlns:w="http://schemas.openxmlformats.org/wordprocessingml/2006/main" xmlns:w14="http://schemas.microsoft.com/office/word/2010/wordml" xmlns:w15="http://schemas.microsoft.com/office/word/2012/wordml" xmlns:w16cex="http://schemas.microsoft.com/office/word/2018/wordml/cex" xmlns:w16cid="http://schemas.microsoft.com/office/word/2016/wordml/cid" xmlns:w16="http://schemas.microsoft.com/office/word/2018/wordml" xmlns:w16du="http://schemas.microsoft.com/office/word/2023/wordml/word16du" xmlns:w16sdtdh="http://schemas.microsoft.com/office/word/2020/wordml/sdtdatahash" xmlns:w16sdtfl="http://schemas.microsoft.com/office/word/2024/wordml/sdtformatlock" xmlns:w16se="http://schemas.microsoft.com/office/word/2015/wordml/symex" xmlns:wpg="http://schemas.microsoft.com/office/word/2010/wordprocessingGroup" xmlns:wpi="http://schemas.microsoft.com/office/word/2010/wordprocessingInk" xmlns:wne="http://schemas.microsoft.com/office/word/2006/wordml" xmlns:wps="http://schemas.microsoft.com/office/word/2010/wordprocessingShape" mc:Ignorable="w14 w15 w16se w16cid w16 w16cex w16sdtdh w16sdtfl w16du wp14">
   <w:tbl>
     <w:tblPr>
-      <w:tblStyle w:val="Grigliatabella"/>
+      <w:tblStyle w:val="TableGrid"/>
       <w:tblW w:w="0" w:type="auto"/>
       <w:tblBorders>
         <w:top w:val="none" w:sz="0" w:space="0" w:color="auto"/>
@@ -2942,13 +3192,8 @@
             <w:t xml:space="preserve">Ingegneria del Software </w:t>
           </w:r>
           <w:r>
-            <w:t xml:space="preserve">- Prof. </w:t>
+            <w:t>- Prof. C.Gravino</w:t>
           </w:r>
-          <w:proofErr w:type="gramStart"/>
-          <w:r>
-            <w:t>C.Gravino</w:t>
-          </w:r>
-          <w:proofErr w:type="gramEnd"/>
         </w:p>
       </w:tc>
     </w:tr>
@@ -2981,6 +3226,95 @@
 <file path=word/numbering.xml><?xml version="1.0" encoding="utf-8"?>
 <w:numbering xmlns:wpc="http://schemas.microsoft.com/office/word/2010/wordprocessingCanvas" xmlns:cx="http://schemas.microsoft.com/office/drawing/2014/chartex" xmlns:cx1="http://schemas.microsoft.com/office/drawing/2015/9/8/chartex" xmlns:cx2="http://schemas.microsoft.com/office/drawing/2015/10/21/chartex" xmlns:cx3="http://schemas.microsoft.com/office/drawing/2016/5/9/chartex" xmlns:cx4="http://schemas.microsoft.com/office/drawing/2016/5/10/chartex" xmlns:cx5="http://schemas.microsoft.com/office/drawing/2016/5/11/chartex" xmlns:cx6="http://schemas.microsoft.com/office/drawing/2016/5/12/chartex" xmlns:cx7="http://schemas.microsoft.com/office/drawing/2016/5/13/chartex" xmlns:cx8="http://schemas.microsoft.com/office/drawing/2016/5/14/chartex" xmlns:mc="http://schemas.openxmlformats.org/markup-compatibility/2006" xmlns:aink="http://schemas.microsoft.com/office/drawing/2016/ink" xmlns:am3d="http://schemas.microsoft.com/office/drawing/2017/model3d" xmlns:o="urn:schemas-microsoft-com:office:office" xmlns:oel="http://schemas.microsoft.com/office/2019/extlst" xmlns:r="http://schemas.openxmlformats.org/officeDocument/2006/relationships" xmlns:m="http://schemas.openxmlformats.org/officeDocument/2006/math" xmlns:v="urn:schemas-microsoft-com:vml" xmlns:wp14="http://schemas.microsoft.com/office/word/2010/wordprocessingDrawing" xmlns:wp="http://schemas.openxmlformats.org/drawingml/2006/wordprocessingDrawing" xmlns:w10="urn:schemas-microsoft-com:office:word" xmlns:w="http://schemas.openxmlformats.org/wordprocessingml/2006/main" xmlns:w14="http://schemas.microsoft.com/office/word/2010/wordml" xmlns:w15="http://schemas.microsoft.com/office/word/2012/wordml" xmlns:w16cex="http://schemas.microsoft.com/office/word/2018/wordml/cex" xmlns:w16cid="http://schemas.microsoft.com/office/word/2016/wordml/cid" xmlns:w16="http://schemas.microsoft.com/office/word/2018/wordml" xmlns:w16du="http://schemas.microsoft.com/office/word/2023/wordml/word16du" xmlns:w16sdtdh="http://schemas.microsoft.com/office/word/2020/wordml/sdtdatahash" xmlns:w16sdtfl="http://schemas.microsoft.com/office/word/2024/wordml/sdtformatlock" xmlns:w16se="http://schemas.microsoft.com/office/word/2015/wordml/symex" xmlns:wpg="http://schemas.microsoft.com/office/word/2010/wordprocessingGroup" xmlns:wpi="http://schemas.microsoft.com/office/word/2010/wordprocessingInk" xmlns:wne="http://schemas.microsoft.com/office/word/2006/wordml" xmlns:wps="http://schemas.microsoft.com/office/word/2010/wordprocessingShape" mc:Ignorable="w14 w15 w16se w16cid w16 w16cex w16sdtdh w16sdtfl w16du wp14">
   <w:abstractNum w:abstractNumId="0" w15:restartNumberingAfterBreak="0">
+    <w:nsid w:val="03D52687"/>
+    <w:multiLevelType w:val="hybridMultilevel"/>
+    <w:tmpl w:val="80B0746A"/>
+    <w:lvl w:ilvl="0" w:tplc="0410000F">
+      <w:start w:val="1"/>
+      <w:numFmt w:val="decimal"/>
+      <w:lvlText w:val="%1."/>
+      <w:lvlJc w:val="left"/>
+      <w:pPr>
+        <w:ind w:left="720" w:hanging="360"/>
+      </w:pPr>
+      <w:rPr>
+        <w:rFonts w:hint="default"/>
+      </w:rPr>
+    </w:lvl>
+    <w:lvl w:ilvl="1" w:tplc="04100019" w:tentative="1">
+      <w:start w:val="1"/>
+      <w:numFmt w:val="lowerLetter"/>
+      <w:lvlText w:val="%2."/>
+      <w:lvlJc w:val="left"/>
+      <w:pPr>
+        <w:ind w:left="1440" w:hanging="360"/>
+      </w:pPr>
+    </w:lvl>
+    <w:lvl w:ilvl="2" w:tplc="0410001B" w:tentative="1">
+      <w:start w:val="1"/>
+      <w:numFmt w:val="lowerRoman"/>
+      <w:lvlText w:val="%3."/>
+      <w:lvlJc w:val="right"/>
+      <w:pPr>
+        <w:ind w:left="2160" w:hanging="180"/>
+      </w:pPr>
+    </w:lvl>
+    <w:lvl w:ilvl="3" w:tplc="0410000F" w:tentative="1">
+      <w:start w:val="1"/>
+      <w:numFmt w:val="decimal"/>
+      <w:lvlText w:val="%4."/>
+      <w:lvlJc w:val="left"/>
+      <w:pPr>
+        <w:ind w:left="2880" w:hanging="360"/>
+      </w:pPr>
+    </w:lvl>
+    <w:lvl w:ilvl="4" w:tplc="04100019" w:tentative="1">
+      <w:start w:val="1"/>
+      <w:numFmt w:val="lowerLetter"/>
+      <w:lvlText w:val="%5."/>
+      <w:lvlJc w:val="left"/>
+      <w:pPr>
+        <w:ind w:left="3600" w:hanging="360"/>
+      </w:pPr>
+    </w:lvl>
+    <w:lvl w:ilvl="5" w:tplc="0410001B" w:tentative="1">
+      <w:start w:val="1"/>
+      <w:numFmt w:val="lowerRoman"/>
+      <w:lvlText w:val="%6."/>
+      <w:lvlJc w:val="right"/>
+      <w:pPr>
+        <w:ind w:left="4320" w:hanging="180"/>
+      </w:pPr>
+    </w:lvl>
+    <w:lvl w:ilvl="6" w:tplc="0410000F" w:tentative="1">
+      <w:start w:val="1"/>
+      <w:numFmt w:val="decimal"/>
+      <w:lvlText w:val="%7."/>
+      <w:lvlJc w:val="left"/>
+      <w:pPr>
+        <w:ind w:left="5040" w:hanging="360"/>
+      </w:pPr>
+    </w:lvl>
+    <w:lvl w:ilvl="7" w:tplc="04100019" w:tentative="1">
+      <w:start w:val="1"/>
+      <w:numFmt w:val="lowerLetter"/>
+      <w:lvlText w:val="%8."/>
+      <w:lvlJc w:val="left"/>
+      <w:pPr>
+        <w:ind w:left="5760" w:hanging="360"/>
+      </w:pPr>
+    </w:lvl>
+    <w:lvl w:ilvl="8" w:tplc="0410001B" w:tentative="1">
+      <w:start w:val="1"/>
+      <w:numFmt w:val="lowerRoman"/>
+      <w:lvlText w:val="%9."/>
+      <w:lvlJc w:val="right"/>
+      <w:pPr>
+        <w:ind w:left="6480" w:hanging="180"/>
+      </w:pPr>
+    </w:lvl>
+  </w:abstractNum>
+  <w:abstractNum w:abstractNumId="1" w15:restartNumberingAfterBreak="0">
     <w:nsid w:val="0D0D4E72"/>
     <w:multiLevelType w:val="hybridMultilevel"/>
     <w:tmpl w:val="42BC9504"/>
@@ -3093,7 +3427,7 @@
       </w:rPr>
     </w:lvl>
   </w:abstractNum>
-  <w:abstractNum w:abstractNumId="1" w15:restartNumberingAfterBreak="0">
+  <w:abstractNum w:abstractNumId="2" w15:restartNumberingAfterBreak="0">
     <w:nsid w:val="13EA2CBA"/>
     <w:multiLevelType w:val="multilevel"/>
     <w:tmpl w:val="3AC26F22"/>
@@ -3206,7 +3540,268 @@
       </w:rPr>
     </w:lvl>
   </w:abstractNum>
-  <w:abstractNum w:abstractNumId="2" w15:restartNumberingAfterBreak="0">
+  <w:abstractNum w:abstractNumId="3" w15:restartNumberingAfterBreak="0">
+    <w:nsid w:val="1405489A"/>
+    <w:multiLevelType w:val="hybridMultilevel"/>
+    <w:tmpl w:val="41523E72"/>
+    <w:lvl w:ilvl="0" w:tplc="0410000F">
+      <w:start w:val="1"/>
+      <w:numFmt w:val="decimal"/>
+      <w:lvlText w:val="%1."/>
+      <w:lvlJc w:val="left"/>
+      <w:pPr>
+        <w:ind w:left="720" w:hanging="360"/>
+      </w:pPr>
+      <w:rPr>
+        <w:rFonts w:hint="default"/>
+      </w:rPr>
+    </w:lvl>
+    <w:lvl w:ilvl="1" w:tplc="04100019" w:tentative="1">
+      <w:start w:val="1"/>
+      <w:numFmt w:val="lowerLetter"/>
+      <w:lvlText w:val="%2."/>
+      <w:lvlJc w:val="left"/>
+      <w:pPr>
+        <w:ind w:left="1440" w:hanging="360"/>
+      </w:pPr>
+    </w:lvl>
+    <w:lvl w:ilvl="2" w:tplc="0410001B" w:tentative="1">
+      <w:start w:val="1"/>
+      <w:numFmt w:val="lowerRoman"/>
+      <w:lvlText w:val="%3."/>
+      <w:lvlJc w:val="right"/>
+      <w:pPr>
+        <w:ind w:left="2160" w:hanging="180"/>
+      </w:pPr>
+    </w:lvl>
+    <w:lvl w:ilvl="3" w:tplc="0410000F" w:tentative="1">
+      <w:start w:val="1"/>
+      <w:numFmt w:val="decimal"/>
+      <w:lvlText w:val="%4."/>
+      <w:lvlJc w:val="left"/>
+      <w:pPr>
+        <w:ind w:left="2880" w:hanging="360"/>
+      </w:pPr>
+    </w:lvl>
+    <w:lvl w:ilvl="4" w:tplc="04100019" w:tentative="1">
+      <w:start w:val="1"/>
+      <w:numFmt w:val="lowerLetter"/>
+      <w:lvlText w:val="%5."/>
+      <w:lvlJc w:val="left"/>
+      <w:pPr>
+        <w:ind w:left="3600" w:hanging="360"/>
+      </w:pPr>
+    </w:lvl>
+    <w:lvl w:ilvl="5" w:tplc="0410001B" w:tentative="1">
+      <w:start w:val="1"/>
+      <w:numFmt w:val="lowerRoman"/>
+      <w:lvlText w:val="%6."/>
+      <w:lvlJc w:val="right"/>
+      <w:pPr>
+        <w:ind w:left="4320" w:hanging="180"/>
+      </w:pPr>
+    </w:lvl>
+    <w:lvl w:ilvl="6" w:tplc="0410000F" w:tentative="1">
+      <w:start w:val="1"/>
+      <w:numFmt w:val="decimal"/>
+      <w:lvlText w:val="%7."/>
+      <w:lvlJc w:val="left"/>
+      <w:pPr>
+        <w:ind w:left="5040" w:hanging="360"/>
+      </w:pPr>
+    </w:lvl>
+    <w:lvl w:ilvl="7" w:tplc="04100019" w:tentative="1">
+      <w:start w:val="1"/>
+      <w:numFmt w:val="lowerLetter"/>
+      <w:lvlText w:val="%8."/>
+      <w:lvlJc w:val="left"/>
+      <w:pPr>
+        <w:ind w:left="5760" w:hanging="360"/>
+      </w:pPr>
+    </w:lvl>
+    <w:lvl w:ilvl="8" w:tplc="0410001B" w:tentative="1">
+      <w:start w:val="1"/>
+      <w:numFmt w:val="lowerRoman"/>
+      <w:lvlText w:val="%9."/>
+      <w:lvlJc w:val="right"/>
+      <w:pPr>
+        <w:ind w:left="6480" w:hanging="180"/>
+      </w:pPr>
+    </w:lvl>
+  </w:abstractNum>
+  <w:abstractNum w:abstractNumId="4" w15:restartNumberingAfterBreak="0">
+    <w:nsid w:val="27274B4A"/>
+    <w:multiLevelType w:val="hybridMultilevel"/>
+    <w:tmpl w:val="FFFFFFFF"/>
+    <w:lvl w:ilvl="0" w:tplc="6FC2FFA4">
+      <w:start w:val="1"/>
+      <w:numFmt w:val="decimal"/>
+      <w:lvlText w:val="%1."/>
+      <w:lvlJc w:val="left"/>
+      <w:pPr>
+        <w:ind w:left="720" w:hanging="360"/>
+      </w:pPr>
+    </w:lvl>
+    <w:lvl w:ilvl="1" w:tplc="D1B6DF82">
+      <w:start w:val="1"/>
+      <w:numFmt w:val="decimal"/>
+      <w:lvlText w:val="%2.2"/>
+      <w:lvlJc w:val="left"/>
+      <w:pPr>
+        <w:ind w:left="1440" w:hanging="360"/>
+      </w:pPr>
+    </w:lvl>
+    <w:lvl w:ilvl="2" w:tplc="3AFE94DA">
+      <w:start w:val="1"/>
+      <w:numFmt w:val="lowerRoman"/>
+      <w:lvlText w:val="%3."/>
+      <w:lvlJc w:val="right"/>
+      <w:pPr>
+        <w:ind w:left="2160" w:hanging="180"/>
+      </w:pPr>
+    </w:lvl>
+    <w:lvl w:ilvl="3" w:tplc="10723070">
+      <w:start w:val="1"/>
+      <w:numFmt w:val="decimal"/>
+      <w:lvlText w:val="%4."/>
+      <w:lvlJc w:val="left"/>
+      <w:pPr>
+        <w:ind w:left="2880" w:hanging="360"/>
+      </w:pPr>
+    </w:lvl>
+    <w:lvl w:ilvl="4" w:tplc="A7AA9D70">
+      <w:start w:val="1"/>
+      <w:numFmt w:val="lowerLetter"/>
+      <w:lvlText w:val="%5."/>
+      <w:lvlJc w:val="left"/>
+      <w:pPr>
+        <w:ind w:left="3600" w:hanging="360"/>
+      </w:pPr>
+    </w:lvl>
+    <w:lvl w:ilvl="5" w:tplc="673CEE30">
+      <w:start w:val="1"/>
+      <w:numFmt w:val="lowerRoman"/>
+      <w:lvlText w:val="%6."/>
+      <w:lvlJc w:val="right"/>
+      <w:pPr>
+        <w:ind w:left="4320" w:hanging="180"/>
+      </w:pPr>
+    </w:lvl>
+    <w:lvl w:ilvl="6" w:tplc="4E42CC2E">
+      <w:start w:val="1"/>
+      <w:numFmt w:val="decimal"/>
+      <w:lvlText w:val="%7."/>
+      <w:lvlJc w:val="left"/>
+      <w:pPr>
+        <w:ind w:left="5040" w:hanging="360"/>
+      </w:pPr>
+    </w:lvl>
+    <w:lvl w:ilvl="7" w:tplc="BD7CB366">
+      <w:start w:val="1"/>
+      <w:numFmt w:val="lowerLetter"/>
+      <w:lvlText w:val="%8."/>
+      <w:lvlJc w:val="left"/>
+      <w:pPr>
+        <w:ind w:left="5760" w:hanging="360"/>
+      </w:pPr>
+    </w:lvl>
+    <w:lvl w:ilvl="8" w:tplc="DB201A4C">
+      <w:start w:val="1"/>
+      <w:numFmt w:val="lowerRoman"/>
+      <w:lvlText w:val="%9."/>
+      <w:lvlJc w:val="right"/>
+      <w:pPr>
+        <w:ind w:left="6480" w:hanging="180"/>
+      </w:pPr>
+    </w:lvl>
+  </w:abstractNum>
+  <w:abstractNum w:abstractNumId="5" w15:restartNumberingAfterBreak="0">
+    <w:nsid w:val="2CEFDDD7"/>
+    <w:multiLevelType w:val="hybridMultilevel"/>
+    <w:tmpl w:val="FFFFFFFF"/>
+    <w:lvl w:ilvl="0" w:tplc="828490D0">
+      <w:start w:val="1"/>
+      <w:numFmt w:val="decimal"/>
+      <w:lvlText w:val="%1."/>
+      <w:lvlJc w:val="left"/>
+      <w:pPr>
+        <w:ind w:left="720" w:hanging="360"/>
+      </w:pPr>
+    </w:lvl>
+    <w:lvl w:ilvl="1" w:tplc="1382BEFC">
+      <w:start w:val="1"/>
+      <w:numFmt w:val="decimal"/>
+      <w:lvlText w:val="%2.1"/>
+      <w:lvlJc w:val="left"/>
+      <w:pPr>
+        <w:ind w:left="1440" w:hanging="360"/>
+      </w:pPr>
+    </w:lvl>
+    <w:lvl w:ilvl="2" w:tplc="7C86C650">
+      <w:start w:val="1"/>
+      <w:numFmt w:val="lowerRoman"/>
+      <w:lvlText w:val="%3."/>
+      <w:lvlJc w:val="right"/>
+      <w:pPr>
+        <w:ind w:left="2160" w:hanging="180"/>
+      </w:pPr>
+    </w:lvl>
+    <w:lvl w:ilvl="3" w:tplc="5E229F32">
+      <w:start w:val="1"/>
+      <w:numFmt w:val="decimal"/>
+      <w:lvlText w:val="%4."/>
+      <w:lvlJc w:val="left"/>
+      <w:pPr>
+        <w:ind w:left="2880" w:hanging="360"/>
+      </w:pPr>
+    </w:lvl>
+    <w:lvl w:ilvl="4" w:tplc="AF909ADC">
+      <w:start w:val="1"/>
+      <w:numFmt w:val="lowerLetter"/>
+      <w:lvlText w:val="%5."/>
+      <w:lvlJc w:val="left"/>
+      <w:pPr>
+        <w:ind w:left="3600" w:hanging="360"/>
+      </w:pPr>
+    </w:lvl>
+    <w:lvl w:ilvl="5" w:tplc="7CB80A9A">
+      <w:start w:val="1"/>
+      <w:numFmt w:val="lowerRoman"/>
+      <w:lvlText w:val="%6."/>
+      <w:lvlJc w:val="right"/>
+      <w:pPr>
+        <w:ind w:left="4320" w:hanging="180"/>
+      </w:pPr>
+    </w:lvl>
+    <w:lvl w:ilvl="6" w:tplc="2362F1A2">
+      <w:start w:val="1"/>
+      <w:numFmt w:val="decimal"/>
+      <w:lvlText w:val="%7."/>
+      <w:lvlJc w:val="left"/>
+      <w:pPr>
+        <w:ind w:left="5040" w:hanging="360"/>
+      </w:pPr>
+    </w:lvl>
+    <w:lvl w:ilvl="7" w:tplc="7B4A66DC">
+      <w:start w:val="1"/>
+      <w:numFmt w:val="lowerLetter"/>
+      <w:lvlText w:val="%8."/>
+      <w:lvlJc w:val="left"/>
+      <w:pPr>
+        <w:ind w:left="5760" w:hanging="360"/>
+      </w:pPr>
+    </w:lvl>
+    <w:lvl w:ilvl="8" w:tplc="8482D49A">
+      <w:start w:val="1"/>
+      <w:numFmt w:val="lowerRoman"/>
+      <w:lvlText w:val="%9."/>
+      <w:lvlJc w:val="right"/>
+      <w:pPr>
+        <w:ind w:left="6480" w:hanging="180"/>
+      </w:pPr>
+    </w:lvl>
+  </w:abstractNum>
+  <w:abstractNum w:abstractNumId="6" w15:restartNumberingAfterBreak="0">
     <w:nsid w:val="3736587F"/>
     <w:multiLevelType w:val="hybridMultilevel"/>
     <w:tmpl w:val="AE86B764"/>
@@ -3319,7 +3914,120 @@
       </w:rPr>
     </w:lvl>
   </w:abstractNum>
-  <w:abstractNum w:abstractNumId="3" w15:restartNumberingAfterBreak="0">
+  <w:abstractNum w:abstractNumId="7" w15:restartNumberingAfterBreak="0">
+    <w:nsid w:val="3D231150"/>
+    <w:multiLevelType w:val="hybridMultilevel"/>
+    <w:tmpl w:val="FFFFFFFF"/>
+    <w:lvl w:ilvl="0" w:tplc="962EEA28">
+      <w:start w:val="1"/>
+      <w:numFmt w:val="bullet"/>
+      <w:lvlText w:val=""/>
+      <w:lvlJc w:val="left"/>
+      <w:pPr>
+        <w:ind w:left="720" w:hanging="360"/>
+      </w:pPr>
+      <w:rPr>
+        <w:rFonts w:ascii="Symbol" w:hAnsi="Symbol" w:hint="default"/>
+      </w:rPr>
+    </w:lvl>
+    <w:lvl w:ilvl="1" w:tplc="A87408E4">
+      <w:start w:val="1"/>
+      <w:numFmt w:val="bullet"/>
+      <w:lvlText w:val="o"/>
+      <w:lvlJc w:val="left"/>
+      <w:pPr>
+        <w:ind w:left="1440" w:hanging="360"/>
+      </w:pPr>
+      <w:rPr>
+        <w:rFonts w:ascii="Courier New" w:hAnsi="Courier New" w:hint="default"/>
+      </w:rPr>
+    </w:lvl>
+    <w:lvl w:ilvl="2" w:tplc="812E28EC">
+      <w:start w:val="1"/>
+      <w:numFmt w:val="bullet"/>
+      <w:lvlText w:val="·"/>
+      <w:lvlJc w:val="left"/>
+      <w:pPr>
+        <w:ind w:left="2160" w:hanging="360"/>
+      </w:pPr>
+      <w:rPr>
+        <w:rFonts w:ascii="Symbol" w:hAnsi="Symbol" w:hint="default"/>
+      </w:rPr>
+    </w:lvl>
+    <w:lvl w:ilvl="3" w:tplc="6600978E">
+      <w:start w:val="1"/>
+      <w:numFmt w:val="bullet"/>
+      <w:lvlText w:val=""/>
+      <w:lvlJc w:val="left"/>
+      <w:pPr>
+        <w:ind w:left="2880" w:hanging="360"/>
+      </w:pPr>
+      <w:rPr>
+        <w:rFonts w:ascii="Symbol" w:hAnsi="Symbol" w:hint="default"/>
+      </w:rPr>
+    </w:lvl>
+    <w:lvl w:ilvl="4" w:tplc="B79423A0">
+      <w:start w:val="1"/>
+      <w:numFmt w:val="bullet"/>
+      <w:lvlText w:val="o"/>
+      <w:lvlJc w:val="left"/>
+      <w:pPr>
+        <w:ind w:left="3600" w:hanging="360"/>
+      </w:pPr>
+      <w:rPr>
+        <w:rFonts w:ascii="Courier New" w:hAnsi="Courier New" w:hint="default"/>
+      </w:rPr>
+    </w:lvl>
+    <w:lvl w:ilvl="5" w:tplc="FA8C980C">
+      <w:start w:val="1"/>
+      <w:numFmt w:val="bullet"/>
+      <w:lvlText w:val=""/>
+      <w:lvlJc w:val="left"/>
+      <w:pPr>
+        <w:ind w:left="4320" w:hanging="360"/>
+      </w:pPr>
+      <w:rPr>
+        <w:rFonts w:ascii="Wingdings" w:hAnsi="Wingdings" w:hint="default"/>
+      </w:rPr>
+    </w:lvl>
+    <w:lvl w:ilvl="6" w:tplc="73D08138">
+      <w:start w:val="1"/>
+      <w:numFmt w:val="bullet"/>
+      <w:lvlText w:val=""/>
+      <w:lvlJc w:val="left"/>
+      <w:pPr>
+        <w:ind w:left="5040" w:hanging="360"/>
+      </w:pPr>
+      <w:rPr>
+        <w:rFonts w:ascii="Symbol" w:hAnsi="Symbol" w:hint="default"/>
+      </w:rPr>
+    </w:lvl>
+    <w:lvl w:ilvl="7" w:tplc="A4A288F6">
+      <w:start w:val="1"/>
+      <w:numFmt w:val="bullet"/>
+      <w:lvlText w:val="o"/>
+      <w:lvlJc w:val="left"/>
+      <w:pPr>
+        <w:ind w:left="5760" w:hanging="360"/>
+      </w:pPr>
+      <w:rPr>
+        <w:rFonts w:ascii="Courier New" w:hAnsi="Courier New" w:hint="default"/>
+      </w:rPr>
+    </w:lvl>
+    <w:lvl w:ilvl="8" w:tplc="C8A8906A">
+      <w:start w:val="1"/>
+      <w:numFmt w:val="bullet"/>
+      <w:lvlText w:val=""/>
+      <w:lvlJc w:val="left"/>
+      <w:pPr>
+        <w:ind w:left="6480" w:hanging="360"/>
+      </w:pPr>
+      <w:rPr>
+        <w:rFonts w:ascii="Wingdings" w:hAnsi="Wingdings" w:hint="default"/>
+      </w:rPr>
+    </w:lvl>
+  </w:abstractNum>
+  <w:abstractNum w:abstractNumId="8" w15:restartNumberingAfterBreak="0">
     <w:nsid w:val="3F6F3B6E"/>
     <w:multiLevelType w:val="hybridMultilevel"/>
     <w:tmpl w:val="EDEE82DC"/>
@@ -3432,7 +4140,7 @@
       </w:rPr>
     </w:lvl>
   </w:abstractNum>
-  <w:abstractNum w:abstractNumId="4" w15:restartNumberingAfterBreak="0">
+  <w:abstractNum w:abstractNumId="9" w15:restartNumberingAfterBreak="0">
     <w:nsid w:val="40623021"/>
     <w:multiLevelType w:val="hybridMultilevel"/>
     <w:tmpl w:val="490A56C4"/>
@@ -3545,7 +4253,7 @@
       </w:rPr>
     </w:lvl>
   </w:abstractNum>
-  <w:abstractNum w:abstractNumId="5" w15:restartNumberingAfterBreak="0">
+  <w:abstractNum w:abstractNumId="10" w15:restartNumberingAfterBreak="0">
     <w:nsid w:val="60EB6CF7"/>
     <w:multiLevelType w:val="hybridMultilevel"/>
     <w:tmpl w:val="2CCE602A"/>
@@ -3658,7 +4366,93 @@
       </w:rPr>
     </w:lvl>
   </w:abstractNum>
-  <w:abstractNum w:abstractNumId="6" w15:restartNumberingAfterBreak="0">
+  <w:abstractNum w:abstractNumId="11" w15:restartNumberingAfterBreak="0">
+    <w:nsid w:val="685C54E7"/>
+    <w:multiLevelType w:val="hybridMultilevel"/>
+    <w:tmpl w:val="FFFFFFFF"/>
+    <w:lvl w:ilvl="0" w:tplc="66F07982">
+      <w:start w:val="1"/>
+      <w:numFmt w:val="decimal"/>
+      <w:lvlText w:val="%1."/>
+      <w:lvlJc w:val="left"/>
+      <w:pPr>
+        <w:ind w:left="720" w:hanging="360"/>
+      </w:pPr>
+    </w:lvl>
+    <w:lvl w:ilvl="1" w:tplc="CF6C1D90">
+      <w:start w:val="1"/>
+      <w:numFmt w:val="lowerLetter"/>
+      <w:lvlText w:val="%2."/>
+      <w:lvlJc w:val="left"/>
+      <w:pPr>
+        <w:ind w:left="1440" w:hanging="360"/>
+      </w:pPr>
+    </w:lvl>
+    <w:lvl w:ilvl="2" w:tplc="96F4AA08">
+      <w:start w:val="1"/>
+      <w:numFmt w:val="lowerRoman"/>
+      <w:lvlText w:val="%3."/>
+      <w:lvlJc w:val="right"/>
+      <w:pPr>
+        <w:ind w:left="2160" w:hanging="180"/>
+      </w:pPr>
+    </w:lvl>
+    <w:lvl w:ilvl="3" w:tplc="6C94EB50">
+      <w:start w:val="1"/>
+      <w:numFmt w:val="decimal"/>
+      <w:lvlText w:val="%4."/>
+      <w:lvlJc w:val="left"/>
+      <w:pPr>
+        <w:ind w:left="2880" w:hanging="360"/>
+      </w:pPr>
+    </w:lvl>
+    <w:lvl w:ilvl="4" w:tplc="E960CB10">
+      <w:start w:val="1"/>
+      <w:numFmt w:val="lowerLetter"/>
+      <w:lvlText w:val="%5."/>
+      <w:lvlJc w:val="left"/>
+      <w:pPr>
+        <w:ind w:left="3600" w:hanging="360"/>
+      </w:pPr>
+    </w:lvl>
+    <w:lvl w:ilvl="5" w:tplc="C696FA00">
+      <w:start w:val="1"/>
+      <w:numFmt w:val="lowerRoman"/>
+      <w:lvlText w:val="%6."/>
+      <w:lvlJc w:val="right"/>
+      <w:pPr>
+        <w:ind w:left="4320" w:hanging="180"/>
+      </w:pPr>
+    </w:lvl>
+    <w:lvl w:ilvl="6" w:tplc="5F7EB7C6">
+      <w:start w:val="1"/>
+      <w:numFmt w:val="decimal"/>
+      <w:lvlText w:val="%7."/>
+      <w:lvlJc w:val="left"/>
+      <w:pPr>
+        <w:ind w:left="5040" w:hanging="360"/>
+      </w:pPr>
+    </w:lvl>
+    <w:lvl w:ilvl="7" w:tplc="A82AD376">
+      <w:start w:val="1"/>
+      <w:numFmt w:val="lowerLetter"/>
+      <w:lvlText w:val="%8."/>
+      <w:lvlJc w:val="left"/>
+      <w:pPr>
+        <w:ind w:left="5760" w:hanging="360"/>
+      </w:pPr>
+    </w:lvl>
+    <w:lvl w:ilvl="8" w:tplc="E604E574">
+      <w:start w:val="1"/>
+      <w:numFmt w:val="lowerRoman"/>
+      <w:lvlText w:val="%9."/>
+      <w:lvlJc w:val="right"/>
+      <w:pPr>
+        <w:ind w:left="6480" w:hanging="180"/>
+      </w:pPr>
+    </w:lvl>
+  </w:abstractNum>
+  <w:abstractNum w:abstractNumId="12" w15:restartNumberingAfterBreak="0">
     <w:nsid w:val="785F2291"/>
     <w:multiLevelType w:val="hybridMultilevel"/>
     <w:tmpl w:val="F3D82F2C"/>
@@ -3770,26 +4564,44 @@
       </w:rPr>
     </w:lvl>
   </w:abstractNum>
-  <w:num w:numId="1" w16cid:durableId="1994989362">
+  <w:num w:numId="1" w16cid:durableId="2108505010">
+    <w:abstractNumId w:val="11"/>
+  </w:num>
+  <w:num w:numId="2" w16cid:durableId="409277915">
+    <w:abstractNumId w:val="4"/>
+  </w:num>
+  <w:num w:numId="3" w16cid:durableId="1544174685">
+    <w:abstractNumId w:val="7"/>
+  </w:num>
+  <w:num w:numId="4" w16cid:durableId="1542202245">
+    <w:abstractNumId w:val="5"/>
+  </w:num>
+  <w:num w:numId="5" w16cid:durableId="1994989362">
+    <w:abstractNumId w:val="2"/>
+  </w:num>
+  <w:num w:numId="6" w16cid:durableId="409085446">
+    <w:abstractNumId w:val="12"/>
+  </w:num>
+  <w:num w:numId="7" w16cid:durableId="533732137">
     <w:abstractNumId w:val="1"/>
   </w:num>
-  <w:num w:numId="2" w16cid:durableId="409085446">
+  <w:num w:numId="8" w16cid:durableId="3670028">
+    <w:abstractNumId w:val="8"/>
+  </w:num>
+  <w:num w:numId="9" w16cid:durableId="541791040">
+    <w:abstractNumId w:val="9"/>
+  </w:num>
+  <w:num w:numId="10" w16cid:durableId="1046948845">
     <w:abstractNumId w:val="6"/>
   </w:num>
-  <w:num w:numId="3" w16cid:durableId="533732137">
+  <w:num w:numId="11" w16cid:durableId="712659655">
+    <w:abstractNumId w:val="10"/>
+  </w:num>
+  <w:num w:numId="12" w16cid:durableId="688676684">
     <w:abstractNumId w:val="0"/>
   </w:num>
-  <w:num w:numId="4" w16cid:durableId="3670028">
+  <w:num w:numId="13" w16cid:durableId="492451093">
     <w:abstractNumId w:val="3"/>
-  </w:num>
-  <w:num w:numId="5" w16cid:durableId="541791040">
-    <w:abstractNumId w:val="4"/>
-  </w:num>
-  <w:num w:numId="6" w16cid:durableId="1046948845">
-    <w:abstractNumId w:val="2"/>
-  </w:num>
-  <w:num w:numId="7" w16cid:durableId="712659655">
-    <w:abstractNumId w:val="5"/>
   </w:num>
 </w:numbering>
 </file>
@@ -4191,15 +5003,15 @@
     <w:lsdException w:name="Unresolved Mention" w:semiHidden="1" w:unhideWhenUsed="1"/>
     <w:lsdException w:name="Smart Link" w:semiHidden="1" w:unhideWhenUsed="1"/>
   </w:latentStyles>
-  <w:style w:type="paragraph" w:default="1" w:styleId="Normale">
+  <w:style w:type="paragraph" w:default="1" w:styleId="Normal">
     <w:name w:val="Normal"/>
     <w:qFormat/>
   </w:style>
-  <w:style w:type="paragraph" w:styleId="Titolo1">
+  <w:style w:type="paragraph" w:styleId="Heading1">
     <w:name w:val="heading 1"/>
-    <w:basedOn w:val="Normale"/>
-    <w:next w:val="Normale"/>
-    <w:link w:val="Titolo1Carattere"/>
+    <w:basedOn w:val="Normal"/>
+    <w:next w:val="Normal"/>
+    <w:link w:val="Heading1Char"/>
     <w:uiPriority w:val="9"/>
     <w:qFormat/>
     <w:rsid w:val="002F09FB"/>
@@ -4216,11 +5028,11 @@
       <w:szCs w:val="40"/>
     </w:rPr>
   </w:style>
-  <w:style w:type="paragraph" w:styleId="Titolo2">
+  <w:style w:type="paragraph" w:styleId="Heading2">
     <w:name w:val="heading 2"/>
-    <w:basedOn w:val="Normale"/>
-    <w:next w:val="Normale"/>
-    <w:link w:val="Titolo2Carattere"/>
+    <w:basedOn w:val="Normal"/>
+    <w:next w:val="Normal"/>
+    <w:link w:val="Heading2Char"/>
     <w:uiPriority w:val="9"/>
     <w:unhideWhenUsed/>
     <w:qFormat/>
@@ -4238,11 +5050,11 @@
       <w:szCs w:val="32"/>
     </w:rPr>
   </w:style>
-  <w:style w:type="paragraph" w:styleId="Titolo3">
+  <w:style w:type="paragraph" w:styleId="Heading3">
     <w:name w:val="heading 3"/>
-    <w:basedOn w:val="Normale"/>
-    <w:next w:val="Normale"/>
-    <w:link w:val="Titolo3Carattere"/>
+    <w:basedOn w:val="Normal"/>
+    <w:next w:val="Normal"/>
+    <w:link w:val="Heading3Char"/>
     <w:uiPriority w:val="9"/>
     <w:semiHidden/>
     <w:unhideWhenUsed/>
@@ -4261,11 +5073,11 @@
       <w:szCs w:val="28"/>
     </w:rPr>
   </w:style>
-  <w:style w:type="paragraph" w:styleId="Titolo4">
+  <w:style w:type="paragraph" w:styleId="Heading4">
     <w:name w:val="heading 4"/>
-    <w:basedOn w:val="Normale"/>
-    <w:next w:val="Normale"/>
-    <w:link w:val="Titolo4Carattere"/>
+    <w:basedOn w:val="Normal"/>
+    <w:next w:val="Normal"/>
+    <w:link w:val="Heading4Char"/>
     <w:uiPriority w:val="9"/>
     <w:semiHidden/>
     <w:unhideWhenUsed/>
@@ -4284,11 +5096,11 @@
       <w:color w:val="0F4761" w:themeColor="accent1" w:themeShade="BF"/>
     </w:rPr>
   </w:style>
-  <w:style w:type="paragraph" w:styleId="Titolo5">
+  <w:style w:type="paragraph" w:styleId="Heading5">
     <w:name w:val="heading 5"/>
-    <w:basedOn w:val="Normale"/>
-    <w:next w:val="Normale"/>
-    <w:link w:val="Titolo5Carattere"/>
+    <w:basedOn w:val="Normal"/>
+    <w:next w:val="Normal"/>
+    <w:link w:val="Heading5Char"/>
     <w:uiPriority w:val="9"/>
     <w:semiHidden/>
     <w:unhideWhenUsed/>
@@ -4305,11 +5117,11 @@
       <w:color w:val="0F4761" w:themeColor="accent1" w:themeShade="BF"/>
     </w:rPr>
   </w:style>
-  <w:style w:type="paragraph" w:styleId="Titolo6">
+  <w:style w:type="paragraph" w:styleId="Heading6">
     <w:name w:val="heading 6"/>
-    <w:basedOn w:val="Normale"/>
-    <w:next w:val="Normale"/>
-    <w:link w:val="Titolo6Carattere"/>
+    <w:basedOn w:val="Normal"/>
+    <w:next w:val="Normal"/>
+    <w:link w:val="Heading6Char"/>
     <w:uiPriority w:val="9"/>
     <w:semiHidden/>
     <w:unhideWhenUsed/>
@@ -4328,11 +5140,11 @@
       <w:color w:val="595959" w:themeColor="text1" w:themeTint="A6"/>
     </w:rPr>
   </w:style>
-  <w:style w:type="paragraph" w:styleId="Titolo7">
+  <w:style w:type="paragraph" w:styleId="Heading7">
     <w:name w:val="heading 7"/>
-    <w:basedOn w:val="Normale"/>
-    <w:next w:val="Normale"/>
-    <w:link w:val="Titolo7Carattere"/>
+    <w:basedOn w:val="Normal"/>
+    <w:next w:val="Normal"/>
+    <w:link w:val="Heading7Char"/>
     <w:uiPriority w:val="9"/>
     <w:semiHidden/>
     <w:unhideWhenUsed/>
@@ -4349,11 +5161,11 @@
       <w:color w:val="595959" w:themeColor="text1" w:themeTint="A6"/>
     </w:rPr>
   </w:style>
-  <w:style w:type="paragraph" w:styleId="Titolo8">
+  <w:style w:type="paragraph" w:styleId="Heading8">
     <w:name w:val="heading 8"/>
-    <w:basedOn w:val="Normale"/>
-    <w:next w:val="Normale"/>
-    <w:link w:val="Titolo8Carattere"/>
+    <w:basedOn w:val="Normal"/>
+    <w:next w:val="Normal"/>
+    <w:link w:val="Heading8Char"/>
     <w:uiPriority w:val="9"/>
     <w:semiHidden/>
     <w:unhideWhenUsed/>
@@ -4372,11 +5184,11 @@
       <w:color w:val="272727" w:themeColor="text1" w:themeTint="D8"/>
     </w:rPr>
   </w:style>
-  <w:style w:type="paragraph" w:styleId="Titolo9">
+  <w:style w:type="paragraph" w:styleId="Heading9">
     <w:name w:val="heading 9"/>
-    <w:basedOn w:val="Normale"/>
-    <w:next w:val="Normale"/>
-    <w:link w:val="Titolo9Carattere"/>
+    <w:basedOn w:val="Normal"/>
+    <w:next w:val="Normal"/>
+    <w:link w:val="Heading9Char"/>
     <w:uiPriority w:val="9"/>
     <w:semiHidden/>
     <w:unhideWhenUsed/>
@@ -4393,13 +5205,13 @@
       <w:color w:val="272727" w:themeColor="text1" w:themeTint="D8"/>
     </w:rPr>
   </w:style>
-  <w:style w:type="character" w:default="1" w:styleId="Carpredefinitoparagrafo">
+  <w:style w:type="character" w:default="1" w:styleId="DefaultParagraphFont">
     <w:name w:val="Default Paragraph Font"/>
     <w:uiPriority w:val="1"/>
     <w:semiHidden/>
     <w:unhideWhenUsed/>
   </w:style>
-  <w:style w:type="table" w:default="1" w:styleId="Tabellanormale">
+  <w:style w:type="table" w:default="1" w:styleId="TableNormal">
     <w:name w:val="Normal Table"/>
     <w:uiPriority w:val="99"/>
     <w:semiHidden/>
@@ -4414,16 +5226,16 @@
       </w:tblCellMar>
     </w:tblPr>
   </w:style>
-  <w:style w:type="numbering" w:default="1" w:styleId="Nessunelenco">
+  <w:style w:type="numbering" w:default="1" w:styleId="NoList">
     <w:name w:val="No List"/>
     <w:uiPriority w:val="99"/>
     <w:semiHidden/>
     <w:unhideWhenUsed/>
   </w:style>
-  <w:style w:type="character" w:customStyle="1" w:styleId="Titolo1Carattere">
-    <w:name w:val="Titolo 1 Carattere"/>
-    <w:basedOn w:val="Carpredefinitoparagrafo"/>
-    <w:link w:val="Titolo1"/>
+  <w:style w:type="character" w:customStyle="1" w:styleId="Heading1Char">
+    <w:name w:val="Heading 1 Char"/>
+    <w:basedOn w:val="DefaultParagraphFont"/>
+    <w:link w:val="Heading1"/>
     <w:uiPriority w:val="9"/>
     <w:rsid w:val="002F09FB"/>
     <w:rPr>
@@ -4433,10 +5245,10 @@
       <w:szCs w:val="40"/>
     </w:rPr>
   </w:style>
-  <w:style w:type="character" w:customStyle="1" w:styleId="Titolo2Carattere">
-    <w:name w:val="Titolo 2 Carattere"/>
-    <w:basedOn w:val="Carpredefinitoparagrafo"/>
-    <w:link w:val="Titolo2"/>
+  <w:style w:type="character" w:customStyle="1" w:styleId="Heading2Char">
+    <w:name w:val="Heading 2 Char"/>
+    <w:basedOn w:val="DefaultParagraphFont"/>
+    <w:link w:val="Heading2"/>
     <w:uiPriority w:val="9"/>
     <w:rsid w:val="002F09FB"/>
     <w:rPr>
@@ -4446,10 +5258,10 @@
       <w:szCs w:val="32"/>
     </w:rPr>
   </w:style>
-  <w:style w:type="character" w:customStyle="1" w:styleId="Titolo3Carattere">
-    <w:name w:val="Titolo 3 Carattere"/>
-    <w:basedOn w:val="Carpredefinitoparagrafo"/>
-    <w:link w:val="Titolo3"/>
+  <w:style w:type="character" w:customStyle="1" w:styleId="Heading3Char">
+    <w:name w:val="Heading 3 Char"/>
+    <w:basedOn w:val="DefaultParagraphFont"/>
+    <w:link w:val="Heading3"/>
     <w:uiPriority w:val="9"/>
     <w:semiHidden/>
     <w:rsid w:val="002F09FB"/>
@@ -4460,10 +5272,10 @@
       <w:szCs w:val="28"/>
     </w:rPr>
   </w:style>
-  <w:style w:type="character" w:customStyle="1" w:styleId="Titolo4Carattere">
-    <w:name w:val="Titolo 4 Carattere"/>
-    <w:basedOn w:val="Carpredefinitoparagrafo"/>
-    <w:link w:val="Titolo4"/>
+  <w:style w:type="character" w:customStyle="1" w:styleId="Heading4Char">
+    <w:name w:val="Heading 4 Char"/>
+    <w:basedOn w:val="DefaultParagraphFont"/>
+    <w:link w:val="Heading4"/>
     <w:uiPriority w:val="9"/>
     <w:semiHidden/>
     <w:rsid w:val="002F09FB"/>
@@ -4474,10 +5286,10 @@
       <w:color w:val="0F4761" w:themeColor="accent1" w:themeShade="BF"/>
     </w:rPr>
   </w:style>
-  <w:style w:type="character" w:customStyle="1" w:styleId="Titolo5Carattere">
-    <w:name w:val="Titolo 5 Carattere"/>
-    <w:basedOn w:val="Carpredefinitoparagrafo"/>
-    <w:link w:val="Titolo5"/>
+  <w:style w:type="character" w:customStyle="1" w:styleId="Heading5Char">
+    <w:name w:val="Heading 5 Char"/>
+    <w:basedOn w:val="DefaultParagraphFont"/>
+    <w:link w:val="Heading5"/>
     <w:uiPriority w:val="9"/>
     <w:semiHidden/>
     <w:rsid w:val="002F09FB"/>
@@ -4486,10 +5298,10 @@
       <w:color w:val="0F4761" w:themeColor="accent1" w:themeShade="BF"/>
     </w:rPr>
   </w:style>
-  <w:style w:type="character" w:customStyle="1" w:styleId="Titolo6Carattere">
-    <w:name w:val="Titolo 6 Carattere"/>
-    <w:basedOn w:val="Carpredefinitoparagrafo"/>
-    <w:link w:val="Titolo6"/>
+  <w:style w:type="character" w:customStyle="1" w:styleId="Heading6Char">
+    <w:name w:val="Heading 6 Char"/>
+    <w:basedOn w:val="DefaultParagraphFont"/>
+    <w:link w:val="Heading6"/>
     <w:uiPriority w:val="9"/>
     <w:semiHidden/>
     <w:rsid w:val="002F09FB"/>
@@ -4500,10 +5312,10 @@
       <w:color w:val="595959" w:themeColor="text1" w:themeTint="A6"/>
     </w:rPr>
   </w:style>
-  <w:style w:type="character" w:customStyle="1" w:styleId="Titolo7Carattere">
-    <w:name w:val="Titolo 7 Carattere"/>
-    <w:basedOn w:val="Carpredefinitoparagrafo"/>
-    <w:link w:val="Titolo7"/>
+  <w:style w:type="character" w:customStyle="1" w:styleId="Heading7Char">
+    <w:name w:val="Heading 7 Char"/>
+    <w:basedOn w:val="DefaultParagraphFont"/>
+    <w:link w:val="Heading7"/>
     <w:uiPriority w:val="9"/>
     <w:semiHidden/>
     <w:rsid w:val="002F09FB"/>
@@ -4512,10 +5324,10 @@
       <w:color w:val="595959" w:themeColor="text1" w:themeTint="A6"/>
     </w:rPr>
   </w:style>
-  <w:style w:type="character" w:customStyle="1" w:styleId="Titolo8Carattere">
-    <w:name w:val="Titolo 8 Carattere"/>
-    <w:basedOn w:val="Carpredefinitoparagrafo"/>
-    <w:link w:val="Titolo8"/>
+  <w:style w:type="character" w:customStyle="1" w:styleId="Heading8Char">
+    <w:name w:val="Heading 8 Char"/>
+    <w:basedOn w:val="DefaultParagraphFont"/>
+    <w:link w:val="Heading8"/>
     <w:uiPriority w:val="9"/>
     <w:semiHidden/>
     <w:rsid w:val="002F09FB"/>
@@ -4526,10 +5338,10 @@
       <w:color w:val="272727" w:themeColor="text1" w:themeTint="D8"/>
     </w:rPr>
   </w:style>
-  <w:style w:type="character" w:customStyle="1" w:styleId="Titolo9Carattere">
-    <w:name w:val="Titolo 9 Carattere"/>
-    <w:basedOn w:val="Carpredefinitoparagrafo"/>
-    <w:link w:val="Titolo9"/>
+  <w:style w:type="character" w:customStyle="1" w:styleId="Heading9Char">
+    <w:name w:val="Heading 9 Char"/>
+    <w:basedOn w:val="DefaultParagraphFont"/>
+    <w:link w:val="Heading9"/>
     <w:uiPriority w:val="9"/>
     <w:semiHidden/>
     <w:rsid w:val="002F09FB"/>
@@ -4538,11 +5350,11 @@
       <w:color w:val="272727" w:themeColor="text1" w:themeTint="D8"/>
     </w:rPr>
   </w:style>
-  <w:style w:type="paragraph" w:styleId="Titolo">
+  <w:style w:type="paragraph" w:styleId="Title">
     <w:name w:val="Title"/>
-    <w:basedOn w:val="Normale"/>
-    <w:next w:val="Normale"/>
-    <w:link w:val="TitoloCarattere"/>
+    <w:basedOn w:val="Normal"/>
+    <w:next w:val="Normal"/>
+    <w:link w:val="TitleChar"/>
     <w:uiPriority w:val="10"/>
     <w:qFormat/>
     <w:rsid w:val="002F09FB"/>
@@ -4558,10 +5370,10 @@
       <w:szCs w:val="56"/>
     </w:rPr>
   </w:style>
-  <w:style w:type="character" w:customStyle="1" w:styleId="TitoloCarattere">
-    <w:name w:val="Titolo Carattere"/>
-    <w:basedOn w:val="Carpredefinitoparagrafo"/>
-    <w:link w:val="Titolo"/>
+  <w:style w:type="character" w:customStyle="1" w:styleId="TitleChar">
+    <w:name w:val="Title Char"/>
+    <w:basedOn w:val="DefaultParagraphFont"/>
+    <w:link w:val="Title"/>
     <w:uiPriority w:val="10"/>
     <w:rsid w:val="002F09FB"/>
     <w:rPr>
@@ -4572,11 +5384,11 @@
       <w:szCs w:val="56"/>
     </w:rPr>
   </w:style>
-  <w:style w:type="paragraph" w:styleId="Sottotitolo">
+  <w:style w:type="paragraph" w:styleId="Subtitle">
     <w:name w:val="Subtitle"/>
-    <w:basedOn w:val="Normale"/>
-    <w:next w:val="Normale"/>
-    <w:link w:val="SottotitoloCarattere"/>
+    <w:basedOn w:val="Normal"/>
+    <w:next w:val="Normal"/>
+    <w:link w:val="SubtitleChar"/>
     <w:uiPriority w:val="11"/>
     <w:qFormat/>
     <w:rsid w:val="002F09FB"/>
@@ -4593,10 +5405,10 @@
       <w:szCs w:val="28"/>
     </w:rPr>
   </w:style>
-  <w:style w:type="character" w:customStyle="1" w:styleId="SottotitoloCarattere">
-    <w:name w:val="Sottotitolo Carattere"/>
-    <w:basedOn w:val="Carpredefinitoparagrafo"/>
-    <w:link w:val="Sottotitolo"/>
+  <w:style w:type="character" w:customStyle="1" w:styleId="SubtitleChar">
+    <w:name w:val="Subtitle Char"/>
+    <w:basedOn w:val="DefaultParagraphFont"/>
+    <w:link w:val="Subtitle"/>
     <w:uiPriority w:val="11"/>
     <w:rsid w:val="002F09FB"/>
     <w:rPr>
@@ -4607,11 +5419,11 @@
       <w:szCs w:val="28"/>
     </w:rPr>
   </w:style>
-  <w:style w:type="paragraph" w:styleId="Citazione">
+  <w:style w:type="paragraph" w:styleId="Quote">
     <w:name w:val="Quote"/>
-    <w:basedOn w:val="Normale"/>
-    <w:next w:val="Normale"/>
-    <w:link w:val="CitazioneCarattere"/>
+    <w:basedOn w:val="Normal"/>
+    <w:next w:val="Normal"/>
+    <w:link w:val="QuoteChar"/>
     <w:uiPriority w:val="29"/>
     <w:qFormat/>
     <w:rsid w:val="002F09FB"/>
@@ -4625,10 +5437,10 @@
       <w:color w:val="404040" w:themeColor="text1" w:themeTint="BF"/>
     </w:rPr>
   </w:style>
-  <w:style w:type="character" w:customStyle="1" w:styleId="CitazioneCarattere">
-    <w:name w:val="Citazione Carattere"/>
-    <w:basedOn w:val="Carpredefinitoparagrafo"/>
-    <w:link w:val="Citazione"/>
+  <w:style w:type="character" w:customStyle="1" w:styleId="QuoteChar">
+    <w:name w:val="Quote Char"/>
+    <w:basedOn w:val="DefaultParagraphFont"/>
+    <w:link w:val="Quote"/>
     <w:uiPriority w:val="29"/>
     <w:rsid w:val="002F09FB"/>
     <w:rPr>
@@ -4637,9 +5449,9 @@
       <w:color w:val="404040" w:themeColor="text1" w:themeTint="BF"/>
     </w:rPr>
   </w:style>
-  <w:style w:type="paragraph" w:styleId="Paragrafoelenco">
+  <w:style w:type="paragraph" w:styleId="ListParagraph">
     <w:name w:val="List Paragraph"/>
-    <w:basedOn w:val="Normale"/>
+    <w:basedOn w:val="Normal"/>
     <w:uiPriority w:val="34"/>
     <w:qFormat/>
     <w:rsid w:val="002F09FB"/>
@@ -4648,9 +5460,9 @@
       <w:contextualSpacing/>
     </w:pPr>
   </w:style>
-  <w:style w:type="character" w:styleId="Enfasiintensa">
+  <w:style w:type="character" w:styleId="IntenseEmphasis">
     <w:name w:val="Intense Emphasis"/>
-    <w:basedOn w:val="Carpredefinitoparagrafo"/>
+    <w:basedOn w:val="DefaultParagraphFont"/>
     <w:uiPriority w:val="21"/>
     <w:qFormat/>
     <w:rsid w:val="002F09FB"/>
@@ -4660,11 +5472,11 @@
       <w:color w:val="0F4761" w:themeColor="accent1" w:themeShade="BF"/>
     </w:rPr>
   </w:style>
-  <w:style w:type="paragraph" w:styleId="Citazioneintensa">
+  <w:style w:type="paragraph" w:styleId="IntenseQuote">
     <w:name w:val="Intense Quote"/>
-    <w:basedOn w:val="Normale"/>
-    <w:next w:val="Normale"/>
-    <w:link w:val="CitazioneintensaCarattere"/>
+    <w:basedOn w:val="Normal"/>
+    <w:next w:val="Normal"/>
+    <w:link w:val="IntenseQuoteChar"/>
     <w:uiPriority w:val="30"/>
     <w:qFormat/>
     <w:rsid w:val="002F09FB"/>
@@ -4683,10 +5495,10 @@
       <w:color w:val="0F4761" w:themeColor="accent1" w:themeShade="BF"/>
     </w:rPr>
   </w:style>
-  <w:style w:type="character" w:customStyle="1" w:styleId="CitazioneintensaCarattere">
-    <w:name w:val="Citazione intensa Carattere"/>
-    <w:basedOn w:val="Carpredefinitoparagrafo"/>
-    <w:link w:val="Citazioneintensa"/>
+  <w:style w:type="character" w:customStyle="1" w:styleId="IntenseQuoteChar">
+    <w:name w:val="Intense Quote Char"/>
+    <w:basedOn w:val="DefaultParagraphFont"/>
+    <w:link w:val="IntenseQuote"/>
     <w:uiPriority w:val="30"/>
     <w:rsid w:val="002F09FB"/>
     <w:rPr>
@@ -4695,9 +5507,9 @@
       <w:color w:val="0F4761" w:themeColor="accent1" w:themeShade="BF"/>
     </w:rPr>
   </w:style>
-  <w:style w:type="character" w:styleId="Riferimentointenso">
+  <w:style w:type="character" w:styleId="IntenseReference">
     <w:name w:val="Intense Reference"/>
-    <w:basedOn w:val="Carpredefinitoparagrafo"/>
+    <w:basedOn w:val="DefaultParagraphFont"/>
     <w:uiPriority w:val="32"/>
     <w:qFormat/>
     <w:rsid w:val="002F09FB"/>
@@ -4709,9 +5521,9 @@
       <w:spacing w:val="5"/>
     </w:rPr>
   </w:style>
-  <w:style w:type="table" w:styleId="Grigliatabella">
+  <w:style w:type="table" w:styleId="TableGrid">
     <w:name w:val="Table Grid"/>
-    <w:basedOn w:val="Tabellanormale"/>
+    <w:basedOn w:val="TableNormal"/>
     <w:uiPriority w:val="39"/>
     <w:rsid w:val="00B446EA"/>
     <w:pPr>
@@ -4728,9 +5540,9 @@
       </w:tblBorders>
     </w:tblPr>
   </w:style>
-  <w:style w:type="table" w:styleId="Tabellagriglia4-colore1">
+  <w:style w:type="table" w:styleId="GridTable4-Accent1">
     <w:name w:val="Grid Table 4 Accent 1"/>
-    <w:basedOn w:val="Tabellanormale"/>
+    <w:basedOn w:val="TableNormal"/>
     <w:uiPriority w:val="49"/>
     <w:rsid w:val="006471D1"/>
     <w:pPr>
@@ -4804,10 +5616,10 @@
       </w:tcPr>
     </w:tblStylePr>
   </w:style>
-  <w:style w:type="paragraph" w:styleId="Intestazione">
+  <w:style w:type="paragraph" w:styleId="Header">
     <w:name w:val="header"/>
-    <w:basedOn w:val="Normale"/>
-    <w:link w:val="IntestazioneCarattere"/>
+    <w:basedOn w:val="Normal"/>
+    <w:link w:val="HeaderChar"/>
     <w:uiPriority w:val="99"/>
     <w:unhideWhenUsed/>
     <w:rsid w:val="00DA6155"/>
@@ -4819,17 +5631,17 @@
       <w:spacing w:after="0" w:line="240" w:lineRule="auto"/>
     </w:pPr>
   </w:style>
-  <w:style w:type="character" w:customStyle="1" w:styleId="IntestazioneCarattere">
-    <w:name w:val="Intestazione Carattere"/>
-    <w:basedOn w:val="Carpredefinitoparagrafo"/>
-    <w:link w:val="Intestazione"/>
+  <w:style w:type="character" w:customStyle="1" w:styleId="HeaderChar">
+    <w:name w:val="Header Char"/>
+    <w:basedOn w:val="DefaultParagraphFont"/>
+    <w:link w:val="Header"/>
     <w:uiPriority w:val="99"/>
     <w:rsid w:val="00DA6155"/>
   </w:style>
-  <w:style w:type="paragraph" w:styleId="Pidipagina">
+  <w:style w:type="paragraph" w:styleId="Footer">
     <w:name w:val="footer"/>
-    <w:basedOn w:val="Normale"/>
-    <w:link w:val="PidipaginaCarattere"/>
+    <w:basedOn w:val="Normal"/>
+    <w:link w:val="FooterChar"/>
     <w:uiPriority w:val="99"/>
     <w:unhideWhenUsed/>
     <w:rsid w:val="00DA6155"/>
@@ -4841,16 +5653,16 @@
       <w:spacing w:after="0" w:line="240" w:lineRule="auto"/>
     </w:pPr>
   </w:style>
-  <w:style w:type="character" w:customStyle="1" w:styleId="PidipaginaCarattere">
-    <w:name w:val="Piè di pagina Carattere"/>
-    <w:basedOn w:val="Carpredefinitoparagrafo"/>
-    <w:link w:val="Pidipagina"/>
+  <w:style w:type="character" w:customStyle="1" w:styleId="FooterChar">
+    <w:name w:val="Footer Char"/>
+    <w:basedOn w:val="DefaultParagraphFont"/>
+    <w:link w:val="Footer"/>
     <w:uiPriority w:val="99"/>
     <w:rsid w:val="00DA6155"/>
   </w:style>
-  <w:style w:type="table" w:styleId="Tabellagriglia5scura-colore4">
+  <w:style w:type="table" w:styleId="GridTable5Dark-Accent4">
     <w:name w:val="Grid Table 5 Dark Accent 4"/>
-    <w:basedOn w:val="Tabellanormale"/>
+    <w:basedOn w:val="TableNormal"/>
     <w:uiPriority w:val="50"/>
     <w:rsid w:val="005F308C"/>
     <w:pPr>
@@ -4954,9 +5766,9 @@
       </w:tcPr>
     </w:tblStylePr>
   </w:style>
-  <w:style w:type="table" w:styleId="Tabellagriglia4-colore4">
+  <w:style w:type="table" w:styleId="GridTable4-Accent4">
     <w:name w:val="Grid Table 4 Accent 4"/>
-    <w:basedOn w:val="Tabellanormale"/>
+    <w:basedOn w:val="TableNormal"/>
     <w:uiPriority w:val="49"/>
     <w:rsid w:val="005F308C"/>
     <w:pPr>
@@ -5030,9 +5842,9 @@
       </w:tcPr>
     </w:tblStylePr>
   </w:style>
-  <w:style w:type="character" w:styleId="Testosegnaposto">
+  <w:style w:type="character" w:styleId="PlaceholderText">
     <w:name w:val="Placeholder Text"/>
-    <w:basedOn w:val="Carpredefinitoparagrafo"/>
+    <w:basedOn w:val="DefaultParagraphFont"/>
     <w:uiPriority w:val="99"/>
     <w:semiHidden/>
     <w:rsid w:val="002C0B9C"/>
@@ -5040,10 +5852,10 @@
       <w:color w:val="666666"/>
     </w:rPr>
   </w:style>
-  <w:style w:type="paragraph" w:styleId="Titolosommario">
+  <w:style w:type="paragraph" w:styleId="TOCHeading">
     <w:name w:val="TOC Heading"/>
-    <w:basedOn w:val="Titolo1"/>
-    <w:next w:val="Normale"/>
+    <w:basedOn w:val="Heading1"/>
+    <w:next w:val="Normal"/>
     <w:uiPriority w:val="39"/>
     <w:unhideWhenUsed/>
     <w:qFormat/>
@@ -5060,10 +5872,10 @@
       <w14:ligatures w14:val="none"/>
     </w:rPr>
   </w:style>
-  <w:style w:type="paragraph" w:styleId="Sommario2">
+  <w:style w:type="paragraph" w:styleId="TOC2">
     <w:name w:val="toc 2"/>
-    <w:basedOn w:val="Normale"/>
-    <w:next w:val="Normale"/>
+    <w:basedOn w:val="Normal"/>
+    <w:next w:val="Normal"/>
     <w:autoRedefine/>
     <w:uiPriority w:val="39"/>
     <w:unhideWhenUsed/>
@@ -5081,10 +5893,10 @@
       <w14:ligatures w14:val="none"/>
     </w:rPr>
   </w:style>
-  <w:style w:type="paragraph" w:styleId="Sommario1">
+  <w:style w:type="paragraph" w:styleId="TOC1">
     <w:name w:val="toc 1"/>
-    <w:basedOn w:val="Normale"/>
-    <w:next w:val="Normale"/>
+    <w:basedOn w:val="Normal"/>
+    <w:next w:val="Normal"/>
     <w:autoRedefine/>
     <w:uiPriority w:val="39"/>
     <w:unhideWhenUsed/>
@@ -5101,10 +5913,10 @@
       <w14:ligatures w14:val="none"/>
     </w:rPr>
   </w:style>
-  <w:style w:type="paragraph" w:styleId="Sommario3">
+  <w:style w:type="paragraph" w:styleId="TOC3">
     <w:name w:val="toc 3"/>
-    <w:basedOn w:val="Normale"/>
-    <w:next w:val="Normale"/>
+    <w:basedOn w:val="Normal"/>
+    <w:next w:val="Normal"/>
     <w:autoRedefine/>
     <w:uiPriority w:val="39"/>
     <w:unhideWhenUsed/>
@@ -5122,9 +5934,9 @@
       <w14:ligatures w14:val="none"/>
     </w:rPr>
   </w:style>
-  <w:style w:type="character" w:styleId="Collegamentoipertestuale">
+  <w:style w:type="character" w:styleId="Hyperlink">
     <w:name w:val="Hyperlink"/>
-    <w:basedOn w:val="Carpredefinitoparagrafo"/>
+    <w:basedOn w:val="DefaultParagraphFont"/>
     <w:uiPriority w:val="99"/>
     <w:unhideWhenUsed/>
     <w:rsid w:val="00F5160A"/>

</xml_diff>